<commit_message>
some cleanup and new project
</commit_message>
<xml_diff>
--- a/Proposals/Proposal.docx
+++ b/Proposals/Proposal.docx
@@ -182,7 +182,7 @@
           </w:tcPr>
           <w:p>
             <w:r>
-              <w:t>AI-Powered Question Generation</w:t>
+              <w:t>BrandingIntegration</w:t>
             </w:r>
           </w:p>
         </w:tc>
@@ -198,7 +198,7 @@
           </w:tcPr>
           <w:p>
             <w:r>
-              <w:t>Contextual Understanding</w:t>
+              <w:t>LogoUpload</w:t>
             </w:r>
           </w:p>
         </w:tc>
@@ -214,7 +214,7 @@
           </w:tcPr>
           <w:p>
             <w:r>
-              <w:t>Implement AI model</w:t>
+              <w:t>Logo Upload Functionality</w:t>
             </w:r>
           </w:p>
         </w:tc>
@@ -230,7 +230,7 @@
           </w:tcPr>
           <w:p>
             <w:r>
-              <w:t>Implement AI model for context interpretation from initial project descriptions.</w:t>
+              <w:t>Provide logo upload functionality.</w:t>
             </w:r>
           </w:p>
         </w:tc>
@@ -250,7 +250,7 @@
               <w:jc w:val="center"/>
             </w:pPr>
             <w:r>
-              <w:t>8</w:t>
+              <w:t>6</w:t>
             </w:r>
           </w:p>
         </w:tc>
@@ -282,7 +282,7 @@
           </w:tcPr>
           <w:p>
             <w:r>
-              <w:t>Contextual Understanding</w:t>
+              <w:t>BrandColorsIncorporation</w:t>
             </w:r>
           </w:p>
         </w:tc>
@@ -298,7 +298,7 @@
           </w:tcPr>
           <w:p>
             <w:r>
-              <w:t>Train AI</w:t>
+              <w:t>Hex Code Input</w:t>
             </w:r>
           </w:p>
         </w:tc>
@@ -314,7 +314,7 @@
           </w:tcPr>
           <w:p>
             <w:r>
-              <w:t>Train AI on diverse project datasets for broad context recognition.</w:t>
+              <w:t>Enable input of specific brand hex codes.</w:t>
             </w:r>
           </w:p>
         </w:tc>
@@ -334,7 +334,7 @@
               <w:jc w:val="center"/>
             </w:pPr>
             <w:r>
-              <w:t>8</w:t>
+              <w:t>4</w:t>
             </w:r>
           </w:p>
         </w:tc>
@@ -366,7 +366,7 @@
           </w:tcPr>
           <w:p>
             <w:r>
-              <w:t>Dynamic Questioning</w:t>
+              <w:t>BrandColorsIncorporation</w:t>
             </w:r>
           </w:p>
         </w:tc>
@@ -382,7 +382,7 @@
           </w:tcPr>
           <w:p>
             <w:r>
-              <w:t>Develop algorithm</w:t>
+              <w:t>Color Picker</w:t>
             </w:r>
           </w:p>
         </w:tc>
@@ -398,7 +398,7 @@
           </w:tcPr>
           <w:p>
             <w:r>
-              <w:t>Develop algorithm for question adjustment based on user responses.</w:t>
+              <w:t>Include a color picker for brand colors application.</w:t>
             </w:r>
           </w:p>
         </w:tc>
@@ -418,259 +418,7 @@
               <w:jc w:val="center"/>
             </w:pPr>
             <w:r>
-              <w:t>8</w:t>
-            </w:r>
-          </w:p>
-        </w:tc>
-      </w:tr>
-      <w:tr>
-        <w:tc>
-          <w:tcPr>
-            <w:tcW w:type="dxa" w:w="2160"/>
-            <w:tcBorders>
-              <w:top w:val="single" w:sz="1" w:color="000000"/>
-              <w:left w:val="single" w:sz="1" w:color="000000"/>
-              <w:bottom w:val="single" w:sz="1" w:color="000000"/>
-              <w:right w:val="single" w:sz="1" w:color="000000"/>
-            </w:tcBorders>
-          </w:tcPr>
-          <w:p>
-            <w:r/>
-          </w:p>
-        </w:tc>
-        <w:tc>
-          <w:tcPr>
-            <w:tcW w:type="dxa" w:w="2160"/>
-            <w:tcBorders>
-              <w:top w:val="single" w:sz="1" w:color="000000"/>
-              <w:left w:val="single" w:sz="1" w:color="000000"/>
-              <w:bottom w:val="single" w:sz="1" w:color="000000"/>
-              <w:right w:val="single" w:sz="1" w:color="000000"/>
-            </w:tcBorders>
-          </w:tcPr>
-          <w:p>
-            <w:r>
-              <w:t>Dynamic Questioning</w:t>
-            </w:r>
-          </w:p>
-        </w:tc>
-        <w:tc>
-          <w:tcPr>
-            <w:tcW w:type="dxa" w:w="2160"/>
-            <w:tcBorders>
-              <w:top w:val="single" w:sz="1" w:color="000000"/>
-              <w:left w:val="single" w:sz="1" w:color="000000"/>
-              <w:bottom w:val="single" w:sz="1" w:color="000000"/>
-              <w:right w:val="single" w:sz="1" w:color="000000"/>
-            </w:tcBorders>
-          </w:tcPr>
-          <w:p>
-            <w:r>
-              <w:t>Integrate feedback loop</w:t>
-            </w:r>
-          </w:p>
-        </w:tc>
-        <w:tc>
-          <w:tcPr>
-            <w:tcW w:type="dxa" w:w="2160"/>
-            <w:tcBorders>
-              <w:top w:val="single" w:sz="1" w:color="000000"/>
-              <w:left w:val="single" w:sz="1" w:color="000000"/>
-              <w:bottom w:val="single" w:sz="1" w:color="000000"/>
-              <w:right w:val="single" w:sz="1" w:color="000000"/>
-            </w:tcBorders>
-          </w:tcPr>
-          <w:p>
-            <w:r>
-              <w:t>Integrate feedback loop for continuous question relevance improvement.</w:t>
-            </w:r>
-          </w:p>
-        </w:tc>
-        <w:tc>
-          <w:tcPr>
-            <w:tcW w:type="dxa" w:w="2160"/>
-            <w:tcBorders>
-              <w:top w:val="single" w:sz="1" w:color="000000"/>
-              <w:left w:val="single" w:sz="1" w:color="000000"/>
-              <w:bottom w:val="single" w:sz="1" w:color="000000"/>
-              <w:right w:val="single" w:sz="1" w:color="000000"/>
-            </w:tcBorders>
-            <w:vAlign w:val="center"/>
-          </w:tcPr>
-          <w:p>
-            <w:pPr>
-              <w:jc w:val="center"/>
-            </w:pPr>
-            <w:r>
-              <w:t>8</w:t>
-            </w:r>
-          </w:p>
-        </w:tc>
-      </w:tr>
-      <w:tr>
-        <w:tc>
-          <w:tcPr>
-            <w:tcW w:type="dxa" w:w="2160"/>
-            <w:tcBorders>
-              <w:top w:val="single" w:sz="1" w:color="000000"/>
-              <w:left w:val="single" w:sz="1" w:color="000000"/>
-              <w:bottom w:val="single" w:sz="1" w:color="000000"/>
-              <w:right w:val="single" w:sz="1" w:color="000000"/>
-            </w:tcBorders>
-          </w:tcPr>
-          <w:p>
-            <w:r/>
-          </w:p>
-        </w:tc>
-        <w:tc>
-          <w:tcPr>
-            <w:tcW w:type="dxa" w:w="2160"/>
-            <w:tcBorders>
-              <w:top w:val="single" w:sz="1" w:color="000000"/>
-              <w:left w:val="single" w:sz="1" w:color="000000"/>
-              <w:bottom w:val="single" w:sz="1" w:color="000000"/>
-              <w:right w:val="single" w:sz="1" w:color="000000"/>
-            </w:tcBorders>
-          </w:tcPr>
-          <w:p>
-            <w:r>
-              <w:t>Feedback Loop for Improvement</w:t>
-            </w:r>
-          </w:p>
-        </w:tc>
-        <w:tc>
-          <w:tcPr>
-            <w:tcW w:type="dxa" w:w="2160"/>
-            <w:tcBorders>
-              <w:top w:val="single" w:sz="1" w:color="000000"/>
-              <w:left w:val="single" w:sz="1" w:color="000000"/>
-              <w:bottom w:val="single" w:sz="1" w:color="000000"/>
-              <w:right w:val="single" w:sz="1" w:color="000000"/>
-            </w:tcBorders>
-          </w:tcPr>
-          <w:p>
-            <w:r>
-              <w:t>Create UI component</w:t>
-            </w:r>
-          </w:p>
-        </w:tc>
-        <w:tc>
-          <w:tcPr>
-            <w:tcW w:type="dxa" w:w="2160"/>
-            <w:tcBorders>
-              <w:top w:val="single" w:sz="1" w:color="000000"/>
-              <w:left w:val="single" w:sz="1" w:color="000000"/>
-              <w:bottom w:val="single" w:sz="1" w:color="000000"/>
-              <w:right w:val="single" w:sz="1" w:color="000000"/>
-            </w:tcBorders>
-          </w:tcPr>
-          <w:p>
-            <w:r>
-              <w:t>Create user interface component for feedback on question relevance.</w:t>
-            </w:r>
-          </w:p>
-        </w:tc>
-        <w:tc>
-          <w:tcPr>
-            <w:tcW w:type="dxa" w:w="2160"/>
-            <w:tcBorders>
-              <w:top w:val="single" w:sz="1" w:color="000000"/>
-              <w:left w:val="single" w:sz="1" w:color="000000"/>
-              <w:bottom w:val="single" w:sz="1" w:color="000000"/>
-              <w:right w:val="single" w:sz="1" w:color="000000"/>
-            </w:tcBorders>
-            <w:vAlign w:val="center"/>
-          </w:tcPr>
-          <w:p>
-            <w:pPr>
-              <w:jc w:val="center"/>
-            </w:pPr>
-            <w:r>
-              <w:t>8</w:t>
-            </w:r>
-          </w:p>
-        </w:tc>
-      </w:tr>
-      <w:tr>
-        <w:tc>
-          <w:tcPr>
-            <w:tcW w:type="dxa" w:w="2160"/>
-            <w:tcBorders>
-              <w:top w:val="single" w:sz="1" w:color="000000"/>
-              <w:left w:val="single" w:sz="1" w:color="000000"/>
-              <w:bottom w:val="single" w:sz="1" w:color="000000"/>
-              <w:right w:val="single" w:sz="1" w:color="000000"/>
-            </w:tcBorders>
-          </w:tcPr>
-          <w:p>
-            <w:r/>
-          </w:p>
-        </w:tc>
-        <w:tc>
-          <w:tcPr>
-            <w:tcW w:type="dxa" w:w="2160"/>
-            <w:tcBorders>
-              <w:top w:val="single" w:sz="1" w:color="000000"/>
-              <w:left w:val="single" w:sz="1" w:color="000000"/>
-              <w:bottom w:val="single" w:sz="1" w:color="000000"/>
-              <w:right w:val="single" w:sz="1" w:color="000000"/>
-            </w:tcBorders>
-          </w:tcPr>
-          <w:p>
-            <w:r>
-              <w:t>Feedback Loop for Improvement</w:t>
-            </w:r>
-          </w:p>
-        </w:tc>
-        <w:tc>
-          <w:tcPr>
-            <w:tcW w:type="dxa" w:w="2160"/>
-            <w:tcBorders>
-              <w:top w:val="single" w:sz="1" w:color="000000"/>
-              <w:left w:val="single" w:sz="1" w:color="000000"/>
-              <w:bottom w:val="single" w:sz="1" w:color="000000"/>
-              <w:right w:val="single" w:sz="1" w:color="000000"/>
-            </w:tcBorders>
-          </w:tcPr>
-          <w:p>
-            <w:r>
-              <w:t>Implement backend logic</w:t>
-            </w:r>
-          </w:p>
-        </w:tc>
-        <w:tc>
-          <w:tcPr>
-            <w:tcW w:type="dxa" w:w="2160"/>
-            <w:tcBorders>
-              <w:top w:val="single" w:sz="1" w:color="000000"/>
-              <w:left w:val="single" w:sz="1" w:color="000000"/>
-              <w:bottom w:val="single" w:sz="1" w:color="000000"/>
-              <w:right w:val="single" w:sz="1" w:color="000000"/>
-            </w:tcBorders>
-          </w:tcPr>
-          <w:p>
-            <w:r>
-              <w:t>Implement backend logic to adjust question generation based on user feedback.</w:t>
-            </w:r>
-          </w:p>
-        </w:tc>
-        <w:tc>
-          <w:tcPr>
-            <w:tcW w:type="dxa" w:w="2160"/>
-            <w:tcBorders>
-              <w:top w:val="single" w:sz="1" w:color="000000"/>
-              <w:left w:val="single" w:sz="1" w:color="000000"/>
-              <w:bottom w:val="single" w:sz="1" w:color="000000"/>
-              <w:right w:val="single" w:sz="1" w:color="000000"/>
-            </w:tcBorders>
-            <w:vAlign w:val="center"/>
-          </w:tcPr>
-          <w:p>
-            <w:pPr>
-              <w:jc w:val="center"/>
-            </w:pPr>
-            <w:r>
-              <w:t>8</w:t>
+              <w:t>6</w:t>
             </w:r>
           </w:p>
         </w:tc>
@@ -693,7 +441,7 @@
                 <w:b/>
                 <w:color w:val="FFFFFF"/>
               </w:rPr>
-              <w:t>AI-Powered Question Generation</w:t>
+              <w:t>BrandingIntegration</w:t>
             </w:r>
           </w:p>
         </w:tc>
@@ -779,7 +527,7 @@
                 <w:b/>
                 <w:color w:val="FFFFFF"/>
               </w:rPr>
-              <w:t>48</w:t>
+              <w:t>16</w:t>
             </w:r>
           </w:p>
         </w:tc>
@@ -797,7 +545,7 @@
           </w:tcPr>
           <w:p>
             <w:r>
-              <w:t>Essential Technical Considerations</w:t>
+              <w:t>CompetitiveDifferentiation</w:t>
             </w:r>
           </w:p>
         </w:tc>
@@ -813,7 +561,7 @@
           </w:tcPr>
           <w:p>
             <w:r>
-              <w:t>Scalability</w:t>
+              <w:t>GapAnalysis</w:t>
             </w:r>
           </w:p>
         </w:tc>
@@ -829,7 +577,7 @@
           </w:tcPr>
           <w:p>
             <w:r>
-              <w:t>Design system architecture</w:t>
+              <w:t>Competitive Landscape Analysis</w:t>
             </w:r>
           </w:p>
         </w:tc>
@@ -845,7 +593,7 @@
           </w:tcPr>
           <w:p>
             <w:r>
-              <w:t>Design system architecture for easy scaling and future feature additions.</w:t>
+              <w:t>Conduct analysis of the competitive landscape to identify unmet needs.</w:t>
             </w:r>
           </w:p>
         </w:tc>
@@ -897,7 +645,7 @@
           </w:tcPr>
           <w:p>
             <w:r>
-              <w:t>Scalability</w:t>
+              <w:t>UniqueFeatureDevelopment</w:t>
             </w:r>
           </w:p>
         </w:tc>
@@ -913,7 +661,7 @@
           </w:tcPr>
           <w:p>
             <w:r>
-              <w:t>Implement scalable solutions</w:t>
+              <w:t>Unique Feature Creation</w:t>
             </w:r>
           </w:p>
         </w:tc>
@@ -929,343 +677,7 @@
           </w:tcPr>
           <w:p>
             <w:r>
-              <w:t>Implement scalable cloud services and database solutions.</w:t>
-            </w:r>
-          </w:p>
-        </w:tc>
-        <w:tc>
-          <w:tcPr>
-            <w:tcW w:type="dxa" w:w="2160"/>
-            <w:tcBorders>
-              <w:top w:val="single" w:sz="1" w:color="000000"/>
-              <w:left w:val="single" w:sz="1" w:color="000000"/>
-              <w:bottom w:val="single" w:sz="1" w:color="000000"/>
-              <w:right w:val="single" w:sz="1" w:color="000000"/>
-            </w:tcBorders>
-            <w:vAlign w:val="center"/>
-          </w:tcPr>
-          <w:p>
-            <w:pPr>
-              <w:jc w:val="center"/>
-            </w:pPr>
-            <w:r>
-              <w:t>8</w:t>
-            </w:r>
-          </w:p>
-        </w:tc>
-      </w:tr>
-      <w:tr>
-        <w:tc>
-          <w:tcPr>
-            <w:tcW w:type="dxa" w:w="2160"/>
-            <w:tcBorders>
-              <w:top w:val="single" w:sz="1" w:color="000000"/>
-              <w:left w:val="single" w:sz="1" w:color="000000"/>
-              <w:bottom w:val="single" w:sz="1" w:color="000000"/>
-              <w:right w:val="single" w:sz="1" w:color="000000"/>
-            </w:tcBorders>
-          </w:tcPr>
-          <w:p>
-            <w:r/>
-          </w:p>
-        </w:tc>
-        <w:tc>
-          <w:tcPr>
-            <w:tcW w:type="dxa" w:w="2160"/>
-            <w:tcBorders>
-              <w:top w:val="single" w:sz="1" w:color="000000"/>
-              <w:left w:val="single" w:sz="1" w:color="000000"/>
-              <w:bottom w:val="single" w:sz="1" w:color="000000"/>
-              <w:right w:val="single" w:sz="1" w:color="000000"/>
-            </w:tcBorders>
-          </w:tcPr>
-          <w:p>
-            <w:r>
-              <w:t>Security and Privacy</w:t>
-            </w:r>
-          </w:p>
-        </w:tc>
-        <w:tc>
-          <w:tcPr>
-            <w:tcW w:type="dxa" w:w="2160"/>
-            <w:tcBorders>
-              <w:top w:val="single" w:sz="1" w:color="000000"/>
-              <w:left w:val="single" w:sz="1" w:color="000000"/>
-              <w:bottom w:val="single" w:sz="1" w:color="000000"/>
-              <w:right w:val="single" w:sz="1" w:color="000000"/>
-            </w:tcBorders>
-          </w:tcPr>
-          <w:p>
-            <w:r>
-              <w:t>Enforce data encryption</w:t>
-            </w:r>
-          </w:p>
-        </w:tc>
-        <w:tc>
-          <w:tcPr>
-            <w:tcW w:type="dxa" w:w="2160"/>
-            <w:tcBorders>
-              <w:top w:val="single" w:sz="1" w:color="000000"/>
-              <w:left w:val="single" w:sz="1" w:color="000000"/>
-              <w:bottom w:val="single" w:sz="1" w:color="000000"/>
-              <w:right w:val="single" w:sz="1" w:color="000000"/>
-            </w:tcBorders>
-          </w:tcPr>
-          <w:p>
-            <w:r>
-              <w:t>Enforce data encryption and secure access protocols.</w:t>
-            </w:r>
-          </w:p>
-        </w:tc>
-        <w:tc>
-          <w:tcPr>
-            <w:tcW w:type="dxa" w:w="2160"/>
-            <w:tcBorders>
-              <w:top w:val="single" w:sz="1" w:color="000000"/>
-              <w:left w:val="single" w:sz="1" w:color="000000"/>
-              <w:bottom w:val="single" w:sz="1" w:color="000000"/>
-              <w:right w:val="single" w:sz="1" w:color="000000"/>
-            </w:tcBorders>
-            <w:vAlign w:val="center"/>
-          </w:tcPr>
-          <w:p>
-            <w:pPr>
-              <w:jc w:val="center"/>
-            </w:pPr>
-            <w:r>
-              <w:t>8</w:t>
-            </w:r>
-          </w:p>
-        </w:tc>
-      </w:tr>
-      <w:tr>
-        <w:tc>
-          <w:tcPr>
-            <w:tcW w:type="dxa" w:w="2160"/>
-            <w:tcBorders>
-              <w:top w:val="single" w:sz="1" w:color="000000"/>
-              <w:left w:val="single" w:sz="1" w:color="000000"/>
-              <w:bottom w:val="single" w:sz="1" w:color="000000"/>
-              <w:right w:val="single" w:sz="1" w:color="000000"/>
-            </w:tcBorders>
-          </w:tcPr>
-          <w:p>
-            <w:r/>
-          </w:p>
-        </w:tc>
-        <w:tc>
-          <w:tcPr>
-            <w:tcW w:type="dxa" w:w="2160"/>
-            <w:tcBorders>
-              <w:top w:val="single" w:sz="1" w:color="000000"/>
-              <w:left w:val="single" w:sz="1" w:color="000000"/>
-              <w:bottom w:val="single" w:sz="1" w:color="000000"/>
-              <w:right w:val="single" w:sz="1" w:color="000000"/>
-            </w:tcBorders>
-          </w:tcPr>
-          <w:p>
-            <w:r>
-              <w:t>Security and Privacy</w:t>
-            </w:r>
-          </w:p>
-        </w:tc>
-        <w:tc>
-          <w:tcPr>
-            <w:tcW w:type="dxa" w:w="2160"/>
-            <w:tcBorders>
-              <w:top w:val="single" w:sz="1" w:color="000000"/>
-              <w:left w:val="single" w:sz="1" w:color="000000"/>
-              <w:bottom w:val="single" w:sz="1" w:color="000000"/>
-              <w:right w:val="single" w:sz="1" w:color="000000"/>
-            </w:tcBorders>
-          </w:tcPr>
-          <w:p>
-            <w:r>
-              <w:t>Ensure compliance</w:t>
-            </w:r>
-          </w:p>
-        </w:tc>
-        <w:tc>
-          <w:tcPr>
-            <w:tcW w:type="dxa" w:w="2160"/>
-            <w:tcBorders>
-              <w:top w:val="single" w:sz="1" w:color="000000"/>
-              <w:left w:val="single" w:sz="1" w:color="000000"/>
-              <w:bottom w:val="single" w:sz="1" w:color="000000"/>
-              <w:right w:val="single" w:sz="1" w:color="000000"/>
-            </w:tcBorders>
-          </w:tcPr>
-          <w:p>
-            <w:r>
-              <w:t>Ensure compliance with privacy laws and regulations.</w:t>
-            </w:r>
-          </w:p>
-        </w:tc>
-        <w:tc>
-          <w:tcPr>
-            <w:tcW w:type="dxa" w:w="2160"/>
-            <w:tcBorders>
-              <w:top w:val="single" w:sz="1" w:color="000000"/>
-              <w:left w:val="single" w:sz="1" w:color="000000"/>
-              <w:bottom w:val="single" w:sz="1" w:color="000000"/>
-              <w:right w:val="single" w:sz="1" w:color="000000"/>
-            </w:tcBorders>
-            <w:vAlign w:val="center"/>
-          </w:tcPr>
-          <w:p>
-            <w:pPr>
-              <w:jc w:val="center"/>
-            </w:pPr>
-            <w:r>
-              <w:t>8</w:t>
-            </w:r>
-          </w:p>
-        </w:tc>
-      </w:tr>
-      <w:tr>
-        <w:tc>
-          <w:tcPr>
-            <w:tcW w:type="dxa" w:w="2160"/>
-            <w:tcBorders>
-              <w:top w:val="single" w:sz="1" w:color="000000"/>
-              <w:left w:val="single" w:sz="1" w:color="000000"/>
-              <w:bottom w:val="single" w:sz="1" w:color="000000"/>
-              <w:right w:val="single" w:sz="1" w:color="000000"/>
-            </w:tcBorders>
-          </w:tcPr>
-          <w:p>
-            <w:r/>
-          </w:p>
-        </w:tc>
-        <w:tc>
-          <w:tcPr>
-            <w:tcW w:type="dxa" w:w="2160"/>
-            <w:tcBorders>
-              <w:top w:val="single" w:sz="1" w:color="000000"/>
-              <w:left w:val="single" w:sz="1" w:color="000000"/>
-              <w:bottom w:val="single" w:sz="1" w:color="000000"/>
-              <w:right w:val="single" w:sz="1" w:color="000000"/>
-            </w:tcBorders>
-          </w:tcPr>
-          <w:p>
-            <w:r>
-              <w:t>Feedback Mechanism</w:t>
-            </w:r>
-          </w:p>
-        </w:tc>
-        <w:tc>
-          <w:tcPr>
-            <w:tcW w:type="dxa" w:w="2160"/>
-            <w:tcBorders>
-              <w:top w:val="single" w:sz="1" w:color="000000"/>
-              <w:left w:val="single" w:sz="1" w:color="000000"/>
-              <w:bottom w:val="single" w:sz="1" w:color="000000"/>
-              <w:right w:val="single" w:sz="1" w:color="000000"/>
-            </w:tcBorders>
-          </w:tcPr>
-          <w:p>
-            <w:r>
-              <w:t>Create feedback form</w:t>
-            </w:r>
-          </w:p>
-        </w:tc>
-        <w:tc>
-          <w:tcPr>
-            <w:tcW w:type="dxa" w:w="2160"/>
-            <w:tcBorders>
-              <w:top w:val="single" w:sz="1" w:color="000000"/>
-              <w:left w:val="single" w:sz="1" w:color="000000"/>
-              <w:bottom w:val="single" w:sz="1" w:color="000000"/>
-              <w:right w:val="single" w:sz="1" w:color="000000"/>
-            </w:tcBorders>
-          </w:tcPr>
-          <w:p>
-            <w:r>
-              <w:t>Create a simple and accessible feedback form within the UI.</w:t>
-            </w:r>
-          </w:p>
-        </w:tc>
-        <w:tc>
-          <w:tcPr>
-            <w:tcW w:type="dxa" w:w="2160"/>
-            <w:tcBorders>
-              <w:top w:val="single" w:sz="1" w:color="000000"/>
-              <w:left w:val="single" w:sz="1" w:color="000000"/>
-              <w:bottom w:val="single" w:sz="1" w:color="000000"/>
-              <w:right w:val="single" w:sz="1" w:color="000000"/>
-            </w:tcBorders>
-            <w:vAlign w:val="center"/>
-          </w:tcPr>
-          <w:p>
-            <w:pPr>
-              <w:jc w:val="center"/>
-            </w:pPr>
-            <w:r>
-              <w:t>6</w:t>
-            </w:r>
-          </w:p>
-        </w:tc>
-      </w:tr>
-      <w:tr>
-        <w:tc>
-          <w:tcPr>
-            <w:tcW w:type="dxa" w:w="2160"/>
-            <w:tcBorders>
-              <w:top w:val="single" w:sz="1" w:color="000000"/>
-              <w:left w:val="single" w:sz="1" w:color="000000"/>
-              <w:bottom w:val="single" w:sz="1" w:color="000000"/>
-              <w:right w:val="single" w:sz="1" w:color="000000"/>
-            </w:tcBorders>
-          </w:tcPr>
-          <w:p>
-            <w:r/>
-          </w:p>
-        </w:tc>
-        <w:tc>
-          <w:tcPr>
-            <w:tcW w:type="dxa" w:w="2160"/>
-            <w:tcBorders>
-              <w:top w:val="single" w:sz="1" w:color="000000"/>
-              <w:left w:val="single" w:sz="1" w:color="000000"/>
-              <w:bottom w:val="single" w:sz="1" w:color="000000"/>
-              <w:right w:val="single" w:sz="1" w:color="000000"/>
-            </w:tcBorders>
-          </w:tcPr>
-          <w:p>
-            <w:r>
-              <w:t>Feedback Mechanism</w:t>
-            </w:r>
-          </w:p>
-        </w:tc>
-        <w:tc>
-          <w:tcPr>
-            <w:tcW w:type="dxa" w:w="2160"/>
-            <w:tcBorders>
-              <w:top w:val="single" w:sz="1" w:color="000000"/>
-              <w:left w:val="single" w:sz="1" w:color="000000"/>
-              <w:bottom w:val="single" w:sz="1" w:color="000000"/>
-              <w:right w:val="single" w:sz="1" w:color="000000"/>
-            </w:tcBorders>
-          </w:tcPr>
-          <w:p>
-            <w:r>
-              <w:t>Implement backend support</w:t>
-            </w:r>
-          </w:p>
-        </w:tc>
-        <w:tc>
-          <w:tcPr>
-            <w:tcW w:type="dxa" w:w="2160"/>
-            <w:tcBorders>
-              <w:top w:val="single" w:sz="1" w:color="000000"/>
-              <w:left w:val="single" w:sz="1" w:color="000000"/>
-              <w:bottom w:val="single" w:sz="1" w:color="000000"/>
-              <w:right w:val="single" w:sz="1" w:color="000000"/>
-            </w:tcBorders>
-          </w:tcPr>
-          <w:p>
-            <w:r>
-              <w:t>Implement backend support for collecting and analyzing user feedback.</w:t>
+              <w:t>Develop a unique feature or significantly improve an existing one based on gap analysis.</w:t>
             </w:r>
           </w:p>
         </w:tc>
@@ -1308,7 +720,7 @@
                 <w:b/>
                 <w:color w:val="FFFFFF"/>
               </w:rPr>
-              <w:t>Essential Technical Considerations</w:t>
+              <w:t>CompetitiveDifferentiation</w:t>
             </w:r>
           </w:p>
         </w:tc>
@@ -1394,7 +806,7 @@
                 <w:b/>
                 <w:color w:val="FFFFFF"/>
               </w:rPr>
-              <w:t>46</w:t>
+              <w:t>16</w:t>
             </w:r>
           </w:p>
         </w:tc>
@@ -1412,7 +824,7 @@
           </w:tcPr>
           <w:p>
             <w:r>
-              <w:t>Feature Breakdown and Identification</w:t>
+              <w:t>ContentIntegration</w:t>
             </w:r>
           </w:p>
         </w:tc>
@@ -1428,7 +840,7 @@
           </w:tcPr>
           <w:p>
             <w:r>
-              <w:t>Natural Language Processing (NLP)</w:t>
+              <w:t>VideoUploadAndEmbedding</w:t>
             </w:r>
           </w:p>
         </w:tc>
@@ -1444,7 +856,7 @@
           </w:tcPr>
           <w:p>
             <w:r>
-              <w:t>Implement NLP</w:t>
+              <w:t>Video Format Support</w:t>
             </w:r>
           </w:p>
         </w:tc>
@@ -1460,7 +872,7 @@
           </w:tcPr>
           <w:p>
             <w:r>
-              <w:t>Implement NLP to analyze and extract project features from user descriptions.</w:t>
+              <w:t>Support standard video format uploads.</w:t>
             </w:r>
           </w:p>
         </w:tc>
@@ -1512,7 +924,7 @@
           </w:tcPr>
           <w:p>
             <w:r>
-              <w:t>Natural Language Processing (NLP)</w:t>
+              <w:t>VideoUploadAndEmbedding</w:t>
             </w:r>
           </w:p>
         </w:tc>
@@ -1528,7 +940,7 @@
           </w:tcPr>
           <w:p>
             <w:r>
-              <w:t>Train NLP model</w:t>
+              <w:t>Video Embedding</w:t>
             </w:r>
           </w:p>
         </w:tc>
@@ -1544,7 +956,7 @@
           </w:tcPr>
           <w:p>
             <w:r>
-              <w:t>Train NLP model on software development terminology and concepts.</w:t>
+              <w:t>Ensure ease of video embedding within the template.</w:t>
             </w:r>
           </w:p>
         </w:tc>
@@ -1596,7 +1008,7 @@
           </w:tcPr>
           <w:p>
             <w:r>
-              <w:t>Feature Categorization</w:t>
+              <w:t>DocumentUpload</w:t>
             </w:r>
           </w:p>
         </w:tc>
@@ -1612,7 +1024,7 @@
           </w:tcPr>
           <w:p>
             <w:r>
-              <w:t>Develop categorization algorithm</w:t>
+              <w:t>PDF and DOCX Upload</w:t>
             </w:r>
           </w:p>
         </w:tc>
@@ -1628,175 +1040,7 @@
           </w:tcPr>
           <w:p>
             <w:r>
-              <w:t>Develop categorization algorithm for identifying core vs. peripheral features.</w:t>
-            </w:r>
-          </w:p>
-        </w:tc>
-        <w:tc>
-          <w:tcPr>
-            <w:tcW w:type="dxa" w:w="2160"/>
-            <w:tcBorders>
-              <w:top w:val="single" w:sz="1" w:color="000000"/>
-              <w:left w:val="single" w:sz="1" w:color="000000"/>
-              <w:bottom w:val="single" w:sz="1" w:color="000000"/>
-              <w:right w:val="single" w:sz="1" w:color="000000"/>
-            </w:tcBorders>
-            <w:vAlign w:val="center"/>
-          </w:tcPr>
-          <w:p>
-            <w:pPr>
-              <w:jc w:val="center"/>
-            </w:pPr>
-            <w:r>
-              <w:t>8</w:t>
-            </w:r>
-          </w:p>
-        </w:tc>
-      </w:tr>
-      <w:tr>
-        <w:tc>
-          <w:tcPr>
-            <w:tcW w:type="dxa" w:w="2160"/>
-            <w:tcBorders>
-              <w:top w:val="single" w:sz="1" w:color="000000"/>
-              <w:left w:val="single" w:sz="1" w:color="000000"/>
-              <w:bottom w:val="single" w:sz="1" w:color="000000"/>
-              <w:right w:val="single" w:sz="1" w:color="000000"/>
-            </w:tcBorders>
-          </w:tcPr>
-          <w:p>
-            <w:r/>
-          </w:p>
-        </w:tc>
-        <w:tc>
-          <w:tcPr>
-            <w:tcW w:type="dxa" w:w="2160"/>
-            <w:tcBorders>
-              <w:top w:val="single" w:sz="1" w:color="000000"/>
-              <w:left w:val="single" w:sz="1" w:color="000000"/>
-              <w:bottom w:val="single" w:sz="1" w:color="000000"/>
-              <w:right w:val="single" w:sz="1" w:color="000000"/>
-            </w:tcBorders>
-          </w:tcPr>
-          <w:p>
-            <w:r>
-              <w:t>Feature Categorization</w:t>
-            </w:r>
-          </w:p>
-        </w:tc>
-        <w:tc>
-          <w:tcPr>
-            <w:tcW w:type="dxa" w:w="2160"/>
-            <w:tcBorders>
-              <w:top w:val="single" w:sz="1" w:color="000000"/>
-              <w:left w:val="single" w:sz="1" w:color="000000"/>
-              <w:bottom w:val="single" w:sz="1" w:color="000000"/>
-              <w:right w:val="single" w:sz="1" w:color="000000"/>
-            </w:tcBorders>
-          </w:tcPr>
-          <w:p>
-            <w:r>
-              <w:t>Integrate user interface</w:t>
-            </w:r>
-          </w:p>
-        </w:tc>
-        <w:tc>
-          <w:tcPr>
-            <w:tcW w:type="dxa" w:w="2160"/>
-            <w:tcBorders>
-              <w:top w:val="single" w:sz="1" w:color="000000"/>
-              <w:left w:val="single" w:sz="1" w:color="000000"/>
-              <w:bottom w:val="single" w:sz="1" w:color="000000"/>
-              <w:right w:val="single" w:sz="1" w:color="000000"/>
-            </w:tcBorders>
-          </w:tcPr>
-          <w:p>
-            <w:r>
-              <w:t>Integrate user interface for feature review and adjustment.</w:t>
-            </w:r>
-          </w:p>
-        </w:tc>
-        <w:tc>
-          <w:tcPr>
-            <w:tcW w:type="dxa" w:w="2160"/>
-            <w:tcBorders>
-              <w:top w:val="single" w:sz="1" w:color="000000"/>
-              <w:left w:val="single" w:sz="1" w:color="000000"/>
-              <w:bottom w:val="single" w:sz="1" w:color="000000"/>
-              <w:right w:val="single" w:sz="1" w:color="000000"/>
-            </w:tcBorders>
-            <w:vAlign w:val="center"/>
-          </w:tcPr>
-          <w:p>
-            <w:pPr>
-              <w:jc w:val="center"/>
-            </w:pPr>
-            <w:r>
-              <w:t>8</w:t>
-            </w:r>
-          </w:p>
-        </w:tc>
-      </w:tr>
-      <w:tr>
-        <w:tc>
-          <w:tcPr>
-            <w:tcW w:type="dxa" w:w="2160"/>
-            <w:tcBorders>
-              <w:top w:val="single" w:sz="1" w:color="000000"/>
-              <w:left w:val="single" w:sz="1" w:color="000000"/>
-              <w:bottom w:val="single" w:sz="1" w:color="000000"/>
-              <w:right w:val="single" w:sz="1" w:color="000000"/>
-            </w:tcBorders>
-          </w:tcPr>
-          <w:p>
-            <w:r/>
-          </w:p>
-        </w:tc>
-        <w:tc>
-          <w:tcPr>
-            <w:tcW w:type="dxa" w:w="2160"/>
-            <w:tcBorders>
-              <w:top w:val="single" w:sz="1" w:color="000000"/>
-              <w:left w:val="single" w:sz="1" w:color="000000"/>
-              <w:bottom w:val="single" w:sz="1" w:color="000000"/>
-              <w:right w:val="single" w:sz="1" w:color="000000"/>
-            </w:tcBorders>
-          </w:tcPr>
-          <w:p>
-            <w:r>
-              <w:t>Validation and Confirmation</w:t>
-            </w:r>
-          </w:p>
-        </w:tc>
-        <w:tc>
-          <w:tcPr>
-            <w:tcW w:type="dxa" w:w="2160"/>
-            <w:tcBorders>
-              <w:top w:val="single" w:sz="1" w:color="000000"/>
-              <w:left w:val="single" w:sz="1" w:color="000000"/>
-              <w:bottom w:val="single" w:sz="1" w:color="000000"/>
-              <w:right w:val="single" w:sz="1" w:color="000000"/>
-            </w:tcBorders>
-          </w:tcPr>
-          <w:p>
-            <w:r>
-              <w:t>Create validation step</w:t>
-            </w:r>
-          </w:p>
-        </w:tc>
-        <w:tc>
-          <w:tcPr>
-            <w:tcW w:type="dxa" w:w="2160"/>
-            <w:tcBorders>
-              <w:top w:val="single" w:sz="1" w:color="000000"/>
-              <w:left w:val="single" w:sz="1" w:color="000000"/>
-              <w:bottom w:val="single" w:sz="1" w:color="000000"/>
-              <w:right w:val="single" w:sz="1" w:color="000000"/>
-            </w:tcBorders>
-          </w:tcPr>
-          <w:p>
-            <w:r>
-              <w:t>Create validation step in UI for user confirmation of identified features.</w:t>
+              <w:t>Allow uploading of PDF and DOCX formats.</w:t>
             </w:r>
           </w:p>
         </w:tc>
@@ -1831,90 +1075,6 @@
               <w:bottom w:val="single" w:sz="1" w:color="000000"/>
               <w:right w:val="single" w:sz="1" w:color="000000"/>
             </w:tcBorders>
-          </w:tcPr>
-          <w:p>
-            <w:r/>
-          </w:p>
-        </w:tc>
-        <w:tc>
-          <w:tcPr>
-            <w:tcW w:type="dxa" w:w="2160"/>
-            <w:tcBorders>
-              <w:top w:val="single" w:sz="1" w:color="000000"/>
-              <w:left w:val="single" w:sz="1" w:color="000000"/>
-              <w:bottom w:val="single" w:sz="1" w:color="000000"/>
-              <w:right w:val="single" w:sz="1" w:color="000000"/>
-            </w:tcBorders>
-          </w:tcPr>
-          <w:p>
-            <w:r>
-              <w:t>Validation and Confirmation</w:t>
-            </w:r>
-          </w:p>
-        </w:tc>
-        <w:tc>
-          <w:tcPr>
-            <w:tcW w:type="dxa" w:w="2160"/>
-            <w:tcBorders>
-              <w:top w:val="single" w:sz="1" w:color="000000"/>
-              <w:left w:val="single" w:sz="1" w:color="000000"/>
-              <w:bottom w:val="single" w:sz="1" w:color="000000"/>
-              <w:right w:val="single" w:sz="1" w:color="000000"/>
-            </w:tcBorders>
-          </w:tcPr>
-          <w:p>
-            <w:r>
-              <w:t>Implement logic for adjustments</w:t>
-            </w:r>
-          </w:p>
-        </w:tc>
-        <w:tc>
-          <w:tcPr>
-            <w:tcW w:type="dxa" w:w="2160"/>
-            <w:tcBorders>
-              <w:top w:val="single" w:sz="1" w:color="000000"/>
-              <w:left w:val="single" w:sz="1" w:color="000000"/>
-              <w:bottom w:val="single" w:sz="1" w:color="000000"/>
-              <w:right w:val="single" w:sz="1" w:color="000000"/>
-            </w:tcBorders>
-          </w:tcPr>
-          <w:p>
-            <w:r>
-              <w:t>Implement logic for user adjustments and confirmations to refine AI accuracy.</w:t>
-            </w:r>
-          </w:p>
-        </w:tc>
-        <w:tc>
-          <w:tcPr>
-            <w:tcW w:type="dxa" w:w="2160"/>
-            <w:tcBorders>
-              <w:top w:val="single" w:sz="1" w:color="000000"/>
-              <w:left w:val="single" w:sz="1" w:color="000000"/>
-              <w:bottom w:val="single" w:sz="1" w:color="000000"/>
-              <w:right w:val="single" w:sz="1" w:color="000000"/>
-            </w:tcBorders>
-            <w:vAlign w:val="center"/>
-          </w:tcPr>
-          <w:p>
-            <w:pPr>
-              <w:jc w:val="center"/>
-            </w:pPr>
-            <w:r>
-              <w:t>8</w:t>
-            </w:r>
-          </w:p>
-        </w:tc>
-      </w:tr>
-      <w:tr>
-        <w:tc>
-          <w:tcPr>
-            <w:tcW w:type="dxa" w:w="2160"/>
-            <w:tcBorders>
-              <w:top w:val="single" w:sz="1" w:color="000000"/>
-              <w:left w:val="single" w:sz="1" w:color="000000"/>
-              <w:bottom w:val="single" w:sz="1" w:color="000000"/>
-              <w:right w:val="single" w:sz="1" w:color="000000"/>
-            </w:tcBorders>
             <w:shd w:fill="000000"/>
           </w:tcPr>
           <w:p>
@@ -1923,7 +1083,7 @@
                 <w:b/>
                 <w:color w:val="FFFFFF"/>
               </w:rPr>
-              <w:t>Feature Breakdown and Identification</w:t>
+              <w:t>ContentIntegration</w:t>
             </w:r>
           </w:p>
         </w:tc>
@@ -2009,7 +1169,7 @@
                 <w:b/>
                 <w:color w:val="FFFFFF"/>
               </w:rPr>
-              <w:t>46</w:t>
+              <w:t>22</w:t>
             </w:r>
           </w:p>
         </w:tc>
@@ -2027,7 +1187,7 @@
           </w:tcPr>
           <w:p>
             <w:r>
-              <w:t>Key Integrations and Functionalities</w:t>
+              <w:t>CustomizableTemplates</w:t>
             </w:r>
           </w:p>
         </w:tc>
@@ -2043,7 +1203,7 @@
           </w:tcPr>
           <w:p>
             <w:r>
-              <w:t>Export Functionality</w:t>
+              <w:t>SingleTemplateDesign</w:t>
             </w:r>
           </w:p>
         </w:tc>
@@ -2059,7 +1219,7 @@
           </w:tcPr>
           <w:p>
             <w:r>
-              <w:t>Implement export functionality</w:t>
+              <w:t>Template Development</w:t>
             </w:r>
           </w:p>
         </w:tc>
@@ -2075,7 +1235,7 @@
           </w:tcPr>
           <w:p>
             <w:r>
-              <w:t>Implement functionality for exporting to Trello, Jira, CSV, and JSON formats.</w:t>
+              <w:t>Develop a versatile template suitable for various industries.</w:t>
             </w:r>
           </w:p>
         </w:tc>
@@ -2127,7 +1287,7 @@
           </w:tcPr>
           <w:p>
             <w:r>
-              <w:t>Export Functionality</w:t>
+              <w:t>BasicCustomizationOptions</w:t>
             </w:r>
           </w:p>
         </w:tc>
@@ -2143,7 +1303,7 @@
           </w:tcPr>
           <w:p>
             <w:r>
-              <w:t>Develop API integrations</w:t>
+              <w:t>Color Scheme Modification</w:t>
             </w:r>
           </w:p>
         </w:tc>
@@ -2159,7 +1319,7 @@
           </w:tcPr>
           <w:p>
             <w:r>
-              <w:t>Develop API integrations for seamless project plan exports.</w:t>
+              <w:t>Implement primary color scheme modifications.</w:t>
             </w:r>
           </w:p>
         </w:tc>
@@ -2179,7 +1339,7 @@
               <w:jc w:val="center"/>
             </w:pPr>
             <w:r>
-              <w:t>8</w:t>
+              <w:t>4</w:t>
             </w:r>
           </w:p>
         </w:tc>
@@ -2211,7 +1371,7 @@
           </w:tcPr>
           <w:p>
             <w:r>
-              <w:t>User Interface (UI)</w:t>
+              <w:t>BasicCustomizationOptions</w:t>
             </w:r>
           </w:p>
         </w:tc>
@@ -2227,7 +1387,7 @@
           </w:tcPr>
           <w:p>
             <w:r>
-              <w:t>Design and develop UI</w:t>
+              <w:t>Font Modification</w:t>
             </w:r>
           </w:p>
         </w:tc>
@@ -2243,7 +1403,7 @@
           </w:tcPr>
           <w:p>
             <w:r>
-              <w:t>Design and develop a user-friendly interface for the estimation process.</w:t>
+              <w:t>Implement font choice modifications.</w:t>
             </w:r>
           </w:p>
         </w:tc>
@@ -2263,259 +1423,7 @@
               <w:jc w:val="center"/>
             </w:pPr>
             <w:r>
-              <w:t>8</w:t>
-            </w:r>
-          </w:p>
-        </w:tc>
-      </w:tr>
-      <w:tr>
-        <w:tc>
-          <w:tcPr>
-            <w:tcW w:type="dxa" w:w="2160"/>
-            <w:tcBorders>
-              <w:top w:val="single" w:sz="1" w:color="000000"/>
-              <w:left w:val="single" w:sz="1" w:color="000000"/>
-              <w:bottom w:val="single" w:sz="1" w:color="000000"/>
-              <w:right w:val="single" w:sz="1" w:color="000000"/>
-            </w:tcBorders>
-          </w:tcPr>
-          <w:p>
-            <w:r/>
-          </w:p>
-        </w:tc>
-        <w:tc>
-          <w:tcPr>
-            <w:tcW w:type="dxa" w:w="2160"/>
-            <w:tcBorders>
-              <w:top w:val="single" w:sz="1" w:color="000000"/>
-              <w:left w:val="single" w:sz="1" w:color="000000"/>
-              <w:bottom w:val="single" w:sz="1" w:color="000000"/>
-              <w:right w:val="single" w:sz="1" w:color="000000"/>
-            </w:tcBorders>
-          </w:tcPr>
-          <w:p>
-            <w:r>
-              <w:t>User Interface (UI)</w:t>
-            </w:r>
-          </w:p>
-        </w:tc>
-        <w:tc>
-          <w:tcPr>
-            <w:tcW w:type="dxa" w:w="2160"/>
-            <w:tcBorders>
-              <w:top w:val="single" w:sz="1" w:color="000000"/>
-              <w:left w:val="single" w:sz="1" w:color="000000"/>
-              <w:bottom w:val="single" w:sz="1" w:color="000000"/>
-              <w:right w:val="single" w:sz="1" w:color="000000"/>
-            </w:tcBorders>
-          </w:tcPr>
-          <w:p>
-            <w:r>
-              <w:t>Integrate UI with backend</w:t>
-            </w:r>
-          </w:p>
-        </w:tc>
-        <w:tc>
-          <w:tcPr>
-            <w:tcW w:type="dxa" w:w="2160"/>
-            <w:tcBorders>
-              <w:top w:val="single" w:sz="1" w:color="000000"/>
-              <w:left w:val="single" w:sz="1" w:color="000000"/>
-              <w:bottom w:val="single" w:sz="1" w:color="000000"/>
-              <w:right w:val="single" w:sz="1" w:color="000000"/>
-            </w:tcBorders>
-          </w:tcPr>
-          <w:p>
-            <w:r>
-              <w:t>Integrate UI with backend systems for real-time data processing and display.</w:t>
-            </w:r>
-          </w:p>
-        </w:tc>
-        <w:tc>
-          <w:tcPr>
-            <w:tcW w:type="dxa" w:w="2160"/>
-            <w:tcBorders>
-              <w:top w:val="single" w:sz="1" w:color="000000"/>
-              <w:left w:val="single" w:sz="1" w:color="000000"/>
-              <w:bottom w:val="single" w:sz="1" w:color="000000"/>
-              <w:right w:val="single" w:sz="1" w:color="000000"/>
-            </w:tcBorders>
-            <w:vAlign w:val="center"/>
-          </w:tcPr>
-          <w:p>
-            <w:pPr>
-              <w:jc w:val="center"/>
-            </w:pPr>
-            <w:r>
-              <w:t>8</w:t>
-            </w:r>
-          </w:p>
-        </w:tc>
-      </w:tr>
-      <w:tr>
-        <w:tc>
-          <w:tcPr>
-            <w:tcW w:type="dxa" w:w="2160"/>
-            <w:tcBorders>
-              <w:top w:val="single" w:sz="1" w:color="000000"/>
-              <w:left w:val="single" w:sz="1" w:color="000000"/>
-              <w:bottom w:val="single" w:sz="1" w:color="000000"/>
-              <w:right w:val="single" w:sz="1" w:color="000000"/>
-            </w:tcBorders>
-          </w:tcPr>
-          <w:p>
-            <w:r/>
-          </w:p>
-        </w:tc>
-        <w:tc>
-          <w:tcPr>
-            <w:tcW w:type="dxa" w:w="2160"/>
-            <w:tcBorders>
-              <w:top w:val="single" w:sz="1" w:color="000000"/>
-              <w:left w:val="single" w:sz="1" w:color="000000"/>
-              <w:bottom w:val="single" w:sz="1" w:color="000000"/>
-              <w:right w:val="single" w:sz="1" w:color="000000"/>
-            </w:tcBorders>
-          </w:tcPr>
-          <w:p>
-            <w:r>
-              <w:t>Initial Data Set for AI Training</w:t>
-            </w:r>
-          </w:p>
-        </w:tc>
-        <w:tc>
-          <w:tcPr>
-            <w:tcW w:type="dxa" w:w="2160"/>
-            <w:tcBorders>
-              <w:top w:val="single" w:sz="1" w:color="000000"/>
-              <w:left w:val="single" w:sz="1" w:color="000000"/>
-              <w:bottom w:val="single" w:sz="1" w:color="000000"/>
-              <w:right w:val="single" w:sz="1" w:color="000000"/>
-            </w:tcBorders>
-          </w:tcPr>
-          <w:p>
-            <w:r>
-              <w:t>Collect initial dataset</w:t>
-            </w:r>
-          </w:p>
-        </w:tc>
-        <w:tc>
-          <w:tcPr>
-            <w:tcW w:type="dxa" w:w="2160"/>
-            <w:tcBorders>
-              <w:top w:val="single" w:sz="1" w:color="000000"/>
-              <w:left w:val="single" w:sz="1" w:color="000000"/>
-              <w:bottom w:val="single" w:sz="1" w:color="000000"/>
-              <w:right w:val="single" w:sz="1" w:color="000000"/>
-            </w:tcBorders>
-          </w:tcPr>
-          <w:p>
-            <w:r>
-              <w:t>Collect and anonymize initial dataset for AI training.</w:t>
-            </w:r>
-          </w:p>
-        </w:tc>
-        <w:tc>
-          <w:tcPr>
-            <w:tcW w:type="dxa" w:w="2160"/>
-            <w:tcBorders>
-              <w:top w:val="single" w:sz="1" w:color="000000"/>
-              <w:left w:val="single" w:sz="1" w:color="000000"/>
-              <w:bottom w:val="single" w:sz="1" w:color="000000"/>
-              <w:right w:val="single" w:sz="1" w:color="000000"/>
-            </w:tcBorders>
-            <w:vAlign w:val="center"/>
-          </w:tcPr>
-          <w:p>
-            <w:pPr>
-              <w:jc w:val="center"/>
-            </w:pPr>
-            <w:r>
-              <w:t>8</w:t>
-            </w:r>
-          </w:p>
-        </w:tc>
-      </w:tr>
-      <w:tr>
-        <w:tc>
-          <w:tcPr>
-            <w:tcW w:type="dxa" w:w="2160"/>
-            <w:tcBorders>
-              <w:top w:val="single" w:sz="1" w:color="000000"/>
-              <w:left w:val="single" w:sz="1" w:color="000000"/>
-              <w:bottom w:val="single" w:sz="1" w:color="000000"/>
-              <w:right w:val="single" w:sz="1" w:color="000000"/>
-            </w:tcBorders>
-          </w:tcPr>
-          <w:p>
-            <w:r/>
-          </w:p>
-        </w:tc>
-        <w:tc>
-          <w:tcPr>
-            <w:tcW w:type="dxa" w:w="2160"/>
-            <w:tcBorders>
-              <w:top w:val="single" w:sz="1" w:color="000000"/>
-              <w:left w:val="single" w:sz="1" w:color="000000"/>
-              <w:bottom w:val="single" w:sz="1" w:color="000000"/>
-              <w:right w:val="single" w:sz="1" w:color="000000"/>
-            </w:tcBorders>
-          </w:tcPr>
-          <w:p>
-            <w:r>
-              <w:t>Initial Data Set for AI Training</w:t>
-            </w:r>
-          </w:p>
-        </w:tc>
-        <w:tc>
-          <w:tcPr>
-            <w:tcW w:type="dxa" w:w="2160"/>
-            <w:tcBorders>
-              <w:top w:val="single" w:sz="1" w:color="000000"/>
-              <w:left w:val="single" w:sz="1" w:color="000000"/>
-              <w:bottom w:val="single" w:sz="1" w:color="000000"/>
-              <w:right w:val="single" w:sz="1" w:color="000000"/>
-            </w:tcBorders>
-          </w:tcPr>
-          <w:p>
-            <w:r>
-              <w:t>Prepare data ingestion pipeline</w:t>
-            </w:r>
-          </w:p>
-        </w:tc>
-        <w:tc>
-          <w:tcPr>
-            <w:tcW w:type="dxa" w:w="2160"/>
-            <w:tcBorders>
-              <w:top w:val="single" w:sz="1" w:color="000000"/>
-              <w:left w:val="single" w:sz="1" w:color="000000"/>
-              <w:bottom w:val="single" w:sz="1" w:color="000000"/>
-              <w:right w:val="single" w:sz="1" w:color="000000"/>
-            </w:tcBorders>
-          </w:tcPr>
-          <w:p>
-            <w:r>
-              <w:t>Prepare data ingestion and processing pipeline for AI model training.</w:t>
-            </w:r>
-          </w:p>
-        </w:tc>
-        <w:tc>
-          <w:tcPr>
-            <w:tcW w:type="dxa" w:w="2160"/>
-            <w:tcBorders>
-              <w:top w:val="single" w:sz="1" w:color="000000"/>
-              <w:left w:val="single" w:sz="1" w:color="000000"/>
-              <w:bottom w:val="single" w:sz="1" w:color="000000"/>
-              <w:right w:val="single" w:sz="1" w:color="000000"/>
-            </w:tcBorders>
-            <w:vAlign w:val="center"/>
-          </w:tcPr>
-          <w:p>
-            <w:pPr>
-              <w:jc w:val="center"/>
-            </w:pPr>
-            <w:r>
-              <w:t>8</w:t>
+              <w:t>6</w:t>
             </w:r>
           </w:p>
         </w:tc>
@@ -2538,7 +1446,7 @@
                 <w:b/>
                 <w:color w:val="FFFFFF"/>
               </w:rPr>
-              <w:t>Key Integrations and Functionalities</w:t>
+              <w:t>CustomizableTemplates</w:t>
             </w:r>
           </w:p>
         </w:tc>
@@ -2624,7 +1532,7 @@
                 <w:b/>
                 <w:color w:val="FFFFFF"/>
               </w:rPr>
-              <w:t>48</w:t>
+              <w:t>18</w:t>
             </w:r>
           </w:p>
         </w:tc>
@@ -2642,7 +1550,7 @@
           </w:tcPr>
           <w:p>
             <w:r>
-              <w:t>Rough Time Estimation</w:t>
+              <w:t>FocusedOnSMEs</w:t>
             </w:r>
           </w:p>
         </w:tc>
@@ -2658,7 +1566,7 @@
           </w:tcPr>
           <w:p>
             <w:r>
-              <w:t>Historical Data Analysis</w:t>
+              <w:t>FeaturePrioritization</w:t>
             </w:r>
           </w:p>
         </w:tc>
@@ -2674,7 +1582,7 @@
           </w:tcPr>
           <w:p>
             <w:r>
-              <w:t>Incorporate historical data</w:t>
+              <w:t>SME-focused Feature Development</w:t>
             </w:r>
           </w:p>
         </w:tc>
@@ -2690,7 +1598,7 @@
           </w:tcPr>
           <w:p>
             <w:r>
-              <w:t>Incorporate historical project data for estimation calibration.</w:t>
+              <w:t>Develop features with SME needs in focus.</w:t>
             </w:r>
           </w:p>
         </w:tc>
@@ -2742,7 +1650,7 @@
           </w:tcPr>
           <w:p>
             <w:r>
-              <w:t>Historical Data Analysis</w:t>
+              <w:t>UserExperienceConsiderations</w:t>
             </w:r>
           </w:p>
         </w:tc>
@@ -2758,7 +1666,7 @@
           </w:tcPr>
           <w:p>
             <w:r>
-              <w:t>Develop data analysis tools</w:t>
+              <w:t>SME-tailored Interface</w:t>
             </w:r>
           </w:p>
         </w:tc>
@@ -2774,343 +1682,7 @@
           </w:tcPr>
           <w:p>
             <w:r>
-              <w:t>Develop data analysis tools for extracting estimation insights.</w:t>
-            </w:r>
-          </w:p>
-        </w:tc>
-        <w:tc>
-          <w:tcPr>
-            <w:tcW w:type="dxa" w:w="2160"/>
-            <w:tcBorders>
-              <w:top w:val="single" w:sz="1" w:color="000000"/>
-              <w:left w:val="single" w:sz="1" w:color="000000"/>
-              <w:bottom w:val="single" w:sz="1" w:color="000000"/>
-              <w:right w:val="single" w:sz="1" w:color="000000"/>
-            </w:tcBorders>
-            <w:vAlign w:val="center"/>
-          </w:tcPr>
-          <w:p>
-            <w:pPr>
-              <w:jc w:val="center"/>
-            </w:pPr>
-            <w:r>
-              <w:t>8</w:t>
-            </w:r>
-          </w:p>
-        </w:tc>
-      </w:tr>
-      <w:tr>
-        <w:tc>
-          <w:tcPr>
-            <w:tcW w:type="dxa" w:w="2160"/>
-            <w:tcBorders>
-              <w:top w:val="single" w:sz="1" w:color="000000"/>
-              <w:left w:val="single" w:sz="1" w:color="000000"/>
-              <w:bottom w:val="single" w:sz="1" w:color="000000"/>
-              <w:right w:val="single" w:sz="1" w:color="000000"/>
-            </w:tcBorders>
-          </w:tcPr>
-          <w:p>
-            <w:r/>
-          </w:p>
-        </w:tc>
-        <w:tc>
-          <w:tcPr>
-            <w:tcW w:type="dxa" w:w="2160"/>
-            <w:tcBorders>
-              <w:top w:val="single" w:sz="1" w:color="000000"/>
-              <w:left w:val="single" w:sz="1" w:color="000000"/>
-              <w:bottom w:val="single" w:sz="1" w:color="000000"/>
-              <w:right w:val="single" w:sz="1" w:color="000000"/>
-            </w:tcBorders>
-          </w:tcPr>
-          <w:p>
-            <w:r>
-              <w:t>Estimation Algorithms</w:t>
-            </w:r>
-          </w:p>
-        </w:tc>
-        <w:tc>
-          <w:tcPr>
-            <w:tcW w:type="dxa" w:w="2160"/>
-            <w:tcBorders>
-              <w:top w:val="single" w:sz="1" w:color="000000"/>
-              <w:left w:val="single" w:sz="1" w:color="000000"/>
-              <w:bottom w:val="single" w:sz="1" w:color="000000"/>
-              <w:right w:val="single" w:sz="1" w:color="000000"/>
-            </w:tcBorders>
-          </w:tcPr>
-          <w:p>
-            <w:r>
-              <w:t>Create estimation algorithms</w:t>
-            </w:r>
-          </w:p>
-        </w:tc>
-        <w:tc>
-          <w:tcPr>
-            <w:tcW w:type="dxa" w:w="2160"/>
-            <w:tcBorders>
-              <w:top w:val="single" w:sz="1" w:color="000000"/>
-              <w:left w:val="single" w:sz="1" w:color="000000"/>
-              <w:bottom w:val="single" w:sz="1" w:color="000000"/>
-              <w:right w:val="single" w:sz="1" w:color="000000"/>
-            </w:tcBorders>
-          </w:tcPr>
-          <w:p>
-            <w:r>
-              <w:t>Create algorithms for generating time estimates for tasks and projects.</w:t>
-            </w:r>
-          </w:p>
-        </w:tc>
-        <w:tc>
-          <w:tcPr>
-            <w:tcW w:type="dxa" w:w="2160"/>
-            <w:tcBorders>
-              <w:top w:val="single" w:sz="1" w:color="000000"/>
-              <w:left w:val="single" w:sz="1" w:color="000000"/>
-              <w:bottom w:val="single" w:sz="1" w:color="000000"/>
-              <w:right w:val="single" w:sz="1" w:color="000000"/>
-            </w:tcBorders>
-            <w:vAlign w:val="center"/>
-          </w:tcPr>
-          <w:p>
-            <w:pPr>
-              <w:jc w:val="center"/>
-            </w:pPr>
-            <w:r>
-              <w:t>8</w:t>
-            </w:r>
-          </w:p>
-        </w:tc>
-      </w:tr>
-      <w:tr>
-        <w:tc>
-          <w:tcPr>
-            <w:tcW w:type="dxa" w:w="2160"/>
-            <w:tcBorders>
-              <w:top w:val="single" w:sz="1" w:color="000000"/>
-              <w:left w:val="single" w:sz="1" w:color="000000"/>
-              <w:bottom w:val="single" w:sz="1" w:color="000000"/>
-              <w:right w:val="single" w:sz="1" w:color="000000"/>
-            </w:tcBorders>
-          </w:tcPr>
-          <w:p>
-            <w:r/>
-          </w:p>
-        </w:tc>
-        <w:tc>
-          <w:tcPr>
-            <w:tcW w:type="dxa" w:w="2160"/>
-            <w:tcBorders>
-              <w:top w:val="single" w:sz="1" w:color="000000"/>
-              <w:left w:val="single" w:sz="1" w:color="000000"/>
-              <w:bottom w:val="single" w:sz="1" w:color="000000"/>
-              <w:right w:val="single" w:sz="1" w:color="000000"/>
-            </w:tcBorders>
-          </w:tcPr>
-          <w:p>
-            <w:r>
-              <w:t>Estimation Algorithms</w:t>
-            </w:r>
-          </w:p>
-        </w:tc>
-        <w:tc>
-          <w:tcPr>
-            <w:tcW w:type="dxa" w:w="2160"/>
-            <w:tcBorders>
-              <w:top w:val="single" w:sz="1" w:color="000000"/>
-              <w:left w:val="single" w:sz="1" w:color="000000"/>
-              <w:bottom w:val="single" w:sz="1" w:color="000000"/>
-              <w:right w:val="single" w:sz="1" w:color="000000"/>
-            </w:tcBorders>
-          </w:tcPr>
-          <w:p>
-            <w:r>
-              <w:t>Integrate variability</w:t>
-            </w:r>
-          </w:p>
-        </w:tc>
-        <w:tc>
-          <w:tcPr>
-            <w:tcW w:type="dxa" w:w="2160"/>
-            <w:tcBorders>
-              <w:top w:val="single" w:sz="1" w:color="000000"/>
-              <w:left w:val="single" w:sz="1" w:color="000000"/>
-              <w:bottom w:val="single" w:sz="1" w:color="000000"/>
-              <w:right w:val="single" w:sz="1" w:color="000000"/>
-            </w:tcBorders>
-          </w:tcPr>
-          <w:p>
-            <w:r>
-              <w:t>Integrate variability and confidence intervals in time estimations.</w:t>
-            </w:r>
-          </w:p>
-        </w:tc>
-        <w:tc>
-          <w:tcPr>
-            <w:tcW w:type="dxa" w:w="2160"/>
-            <w:tcBorders>
-              <w:top w:val="single" w:sz="1" w:color="000000"/>
-              <w:left w:val="single" w:sz="1" w:color="000000"/>
-              <w:bottom w:val="single" w:sz="1" w:color="000000"/>
-              <w:right w:val="single" w:sz="1" w:color="000000"/>
-            </w:tcBorders>
-            <w:vAlign w:val="center"/>
-          </w:tcPr>
-          <w:p>
-            <w:pPr>
-              <w:jc w:val="center"/>
-            </w:pPr>
-            <w:r>
-              <w:t>8</w:t>
-            </w:r>
-          </w:p>
-        </w:tc>
-      </w:tr>
-      <w:tr>
-        <w:tc>
-          <w:tcPr>
-            <w:tcW w:type="dxa" w:w="2160"/>
-            <w:tcBorders>
-              <w:top w:val="single" w:sz="1" w:color="000000"/>
-              <w:left w:val="single" w:sz="1" w:color="000000"/>
-              <w:bottom w:val="single" w:sz="1" w:color="000000"/>
-              <w:right w:val="single" w:sz="1" w:color="000000"/>
-            </w:tcBorders>
-          </w:tcPr>
-          <w:p>
-            <w:r/>
-          </w:p>
-        </w:tc>
-        <w:tc>
-          <w:tcPr>
-            <w:tcW w:type="dxa" w:w="2160"/>
-            <w:tcBorders>
-              <w:top w:val="single" w:sz="1" w:color="000000"/>
-              <w:left w:val="single" w:sz="1" w:color="000000"/>
-              <w:bottom w:val="single" w:sz="1" w:color="000000"/>
-              <w:right w:val="single" w:sz="1" w:color="000000"/>
-            </w:tcBorders>
-          </w:tcPr>
-          <w:p>
-            <w:r>
-              <w:t>Adjustable Parameters</w:t>
-            </w:r>
-          </w:p>
-        </w:tc>
-        <w:tc>
-          <w:tcPr>
-            <w:tcW w:type="dxa" w:w="2160"/>
-            <w:tcBorders>
-              <w:top w:val="single" w:sz="1" w:color="000000"/>
-              <w:left w:val="single" w:sz="1" w:color="000000"/>
-              <w:bottom w:val="single" w:sz="1" w:color="000000"/>
-              <w:right w:val="single" w:sz="1" w:color="000000"/>
-            </w:tcBorders>
-          </w:tcPr>
-          <w:p>
-            <w:r>
-              <w:t>Develop UI for parameters</w:t>
-            </w:r>
-          </w:p>
-        </w:tc>
-        <w:tc>
-          <w:tcPr>
-            <w:tcW w:type="dxa" w:w="2160"/>
-            <w:tcBorders>
-              <w:top w:val="single" w:sz="1" w:color="000000"/>
-              <w:left w:val="single" w:sz="1" w:color="000000"/>
-              <w:bottom w:val="single" w:sz="1" w:color="000000"/>
-              <w:right w:val="single" w:sz="1" w:color="000000"/>
-            </w:tcBorders>
-          </w:tcPr>
-          <w:p>
-            <w:r>
-              <w:t>Develop UI for adjusting estimation parameters (team size, expertise level).</w:t>
-            </w:r>
-          </w:p>
-        </w:tc>
-        <w:tc>
-          <w:tcPr>
-            <w:tcW w:type="dxa" w:w="2160"/>
-            <w:tcBorders>
-              <w:top w:val="single" w:sz="1" w:color="000000"/>
-              <w:left w:val="single" w:sz="1" w:color="000000"/>
-              <w:bottom w:val="single" w:sz="1" w:color="000000"/>
-              <w:right w:val="single" w:sz="1" w:color="000000"/>
-            </w:tcBorders>
-            <w:vAlign w:val="center"/>
-          </w:tcPr>
-          <w:p>
-            <w:pPr>
-              <w:jc w:val="center"/>
-            </w:pPr>
-            <w:r>
-              <w:t>6</w:t>
-            </w:r>
-          </w:p>
-        </w:tc>
-      </w:tr>
-      <w:tr>
-        <w:tc>
-          <w:tcPr>
-            <w:tcW w:type="dxa" w:w="2160"/>
-            <w:tcBorders>
-              <w:top w:val="single" w:sz="1" w:color="000000"/>
-              <w:left w:val="single" w:sz="1" w:color="000000"/>
-              <w:bottom w:val="single" w:sz="1" w:color="000000"/>
-              <w:right w:val="single" w:sz="1" w:color="000000"/>
-            </w:tcBorders>
-          </w:tcPr>
-          <w:p>
-            <w:r/>
-          </w:p>
-        </w:tc>
-        <w:tc>
-          <w:tcPr>
-            <w:tcW w:type="dxa" w:w="2160"/>
-            <w:tcBorders>
-              <w:top w:val="single" w:sz="1" w:color="000000"/>
-              <w:left w:val="single" w:sz="1" w:color="000000"/>
-              <w:bottom w:val="single" w:sz="1" w:color="000000"/>
-              <w:right w:val="single" w:sz="1" w:color="000000"/>
-            </w:tcBorders>
-          </w:tcPr>
-          <w:p>
-            <w:r>
-              <w:t>Adjustable Parameters</w:t>
-            </w:r>
-          </w:p>
-        </w:tc>
-        <w:tc>
-          <w:tcPr>
-            <w:tcW w:type="dxa" w:w="2160"/>
-            <w:tcBorders>
-              <w:top w:val="single" w:sz="1" w:color="000000"/>
-              <w:left w:val="single" w:sz="1" w:color="000000"/>
-              <w:bottom w:val="single" w:sz="1" w:color="000000"/>
-              <w:right w:val="single" w:sz="1" w:color="000000"/>
-            </w:tcBorders>
-          </w:tcPr>
-          <w:p>
-            <w:r>
-              <w:t>Implement backend logic for estimates</w:t>
-            </w:r>
-          </w:p>
-        </w:tc>
-        <w:tc>
-          <w:tcPr>
-            <w:tcW w:type="dxa" w:w="2160"/>
-            <w:tcBorders>
-              <w:top w:val="single" w:sz="1" w:color="000000"/>
-              <w:left w:val="single" w:sz="1" w:color="000000"/>
-              <w:bottom w:val="single" w:sz="1" w:color="000000"/>
-              <w:right w:val="single" w:sz="1" w:color="000000"/>
-            </w:tcBorders>
-          </w:tcPr>
-          <w:p>
-            <w:r>
-              <w:t>Implement backend logic to refine estimates based on adjusted parameters.</w:t>
+              <w:t>Tailor interface and support for SME challenges and preferences.</w:t>
             </w:r>
           </w:p>
         </w:tc>
@@ -3153,7 +1725,7 @@
                 <w:b/>
                 <w:color w:val="FFFFFF"/>
               </w:rPr>
-              <w:t>Rough Time Estimation</w:t>
+              <w:t>FocusedOnSMEs</w:t>
             </w:r>
           </w:p>
         </w:tc>
@@ -3239,7 +1811,7 @@
                 <w:b/>
                 <w:color w:val="FFFFFF"/>
               </w:rPr>
-              <w:t>46</w:t>
+              <w:t>16</w:t>
             </w:r>
           </w:p>
         </w:tc>
@@ -3257,7 +1829,7 @@
           </w:tcPr>
           <w:p>
             <w:r>
-              <w:t>Story and Task Delineation</w:t>
+              <w:t>IntuitiveUserInterface</w:t>
             </w:r>
           </w:p>
         </w:tc>
@@ -3273,7 +1845,7 @@
           </w:tcPr>
           <w:p>
             <w:r>
-              <w:t>Automated Story Generation</w:t>
+              <w:t>SimplicityAndAccessibility</w:t>
             </w:r>
           </w:p>
         </w:tc>
@@ -3289,7 +1861,7 @@
           </w:tcPr>
           <w:p>
             <w:r>
-              <w:t>Develop algorithm for stories</w:t>
+              <w:t>Navigable Interface Design</w:t>
             </w:r>
           </w:p>
         </w:tc>
@@ -3305,7 +1877,7 @@
           </w:tcPr>
           <w:p>
             <w:r>
-              <w:t>Develop algorithm for converting identified features into user stories.</w:t>
+              <w:t>Design an easily navigable interface.</w:t>
             </w:r>
           </w:p>
         </w:tc>
@@ -3357,7 +1929,7 @@
           </w:tcPr>
           <w:p>
             <w:r>
-              <w:t>Automated Story Generation</w:t>
+              <w:t>SimplicityAndAccessibility</w:t>
             </w:r>
           </w:p>
         </w:tc>
@@ -3373,7 +1945,7 @@
           </w:tcPr>
           <w:p>
             <w:r>
-              <w:t>Integrate story generation</w:t>
+              <w:t>Clear Instructions</w:t>
             </w:r>
           </w:p>
         </w:tc>
@@ -3389,7 +1961,7 @@
           </w:tcPr>
           <w:p>
             <w:r>
-              <w:t>Integrate story generation within the feature identification process.</w:t>
+              <w:t>Provide clear instructions and a logical layout.</w:t>
             </w:r>
           </w:p>
         </w:tc>
@@ -3409,7 +1981,7 @@
               <w:jc w:val="center"/>
             </w:pPr>
             <w:r>
-              <w:t>8</w:t>
+              <w:t>4</w:t>
             </w:r>
           </w:p>
         </w:tc>
@@ -3441,7 +2013,7 @@
           </w:tcPr>
           <w:p>
             <w:r>
-              <w:t>Task Breakdown</w:t>
+              <w:t>AdvancedFeaturesAccessibility</w:t>
             </w:r>
           </w:p>
         </w:tc>
@@ -3457,7 +2029,7 @@
           </w:tcPr>
           <w:p>
             <w:r>
-              <w:t>Implement task breakdown logic</w:t>
+              <w:t>Advanced Customization Features</w:t>
             </w:r>
           </w:p>
         </w:tc>
@@ -3473,259 +2045,7 @@
           </w:tcPr>
           <w:p>
             <w:r>
-              <w:t>Implement task breakdown logic from user stories.</w:t>
-            </w:r>
-          </w:p>
-        </w:tc>
-        <w:tc>
-          <w:tcPr>
-            <w:tcW w:type="dxa" w:w="2160"/>
-            <w:tcBorders>
-              <w:top w:val="single" w:sz="1" w:color="000000"/>
-              <w:left w:val="single" w:sz="1" w:color="000000"/>
-              <w:bottom w:val="single" w:sz="1" w:color="000000"/>
-              <w:right w:val="single" w:sz="1" w:color="000000"/>
-            </w:tcBorders>
-            <w:vAlign w:val="center"/>
-          </w:tcPr>
-          <w:p>
-            <w:pPr>
-              <w:jc w:val="center"/>
-            </w:pPr>
-            <w:r>
-              <w:t>8</w:t>
-            </w:r>
-          </w:p>
-        </w:tc>
-      </w:tr>
-      <w:tr>
-        <w:tc>
-          <w:tcPr>
-            <w:tcW w:type="dxa" w:w="2160"/>
-            <w:tcBorders>
-              <w:top w:val="single" w:sz="1" w:color="000000"/>
-              <w:left w:val="single" w:sz="1" w:color="000000"/>
-              <w:bottom w:val="single" w:sz="1" w:color="000000"/>
-              <w:right w:val="single" w:sz="1" w:color="000000"/>
-            </w:tcBorders>
-          </w:tcPr>
-          <w:p>
-            <w:r/>
-          </w:p>
-        </w:tc>
-        <w:tc>
-          <w:tcPr>
-            <w:tcW w:type="dxa" w:w="2160"/>
-            <w:tcBorders>
-              <w:top w:val="single" w:sz="1" w:color="000000"/>
-              <w:left w:val="single" w:sz="1" w:color="000000"/>
-              <w:bottom w:val="single" w:sz="1" w:color="000000"/>
-              <w:right w:val="single" w:sz="1" w:color="000000"/>
-            </w:tcBorders>
-          </w:tcPr>
-          <w:p>
-            <w:r>
-              <w:t>Task Breakdown</w:t>
-            </w:r>
-          </w:p>
-        </w:tc>
-        <w:tc>
-          <w:tcPr>
-            <w:tcW w:type="dxa" w:w="2160"/>
-            <w:tcBorders>
-              <w:top w:val="single" w:sz="1" w:color="000000"/>
-              <w:left w:val="single" w:sz="1" w:color="000000"/>
-              <w:bottom w:val="single" w:sz="1" w:color="000000"/>
-              <w:right w:val="single" w:sz="1" w:color="000000"/>
-            </w:tcBorders>
-          </w:tcPr>
-          <w:p>
-            <w:r>
-              <w:t>Create UI components</w:t>
-            </w:r>
-          </w:p>
-        </w:tc>
-        <w:tc>
-          <w:tcPr>
-            <w:tcW w:type="dxa" w:w="2160"/>
-            <w:tcBorders>
-              <w:top w:val="single" w:sz="1" w:color="000000"/>
-              <w:left w:val="single" w:sz="1" w:color="000000"/>
-              <w:bottom w:val="single" w:sz="1" w:color="000000"/>
-              <w:right w:val="single" w:sz="1" w:color="000000"/>
-            </w:tcBorders>
-          </w:tcPr>
-          <w:p>
-            <w:r>
-              <w:t>Create UI components for viewing and adjusting task breakdowns.</w:t>
-            </w:r>
-          </w:p>
-        </w:tc>
-        <w:tc>
-          <w:tcPr>
-            <w:tcW w:type="dxa" w:w="2160"/>
-            <w:tcBorders>
-              <w:top w:val="single" w:sz="1" w:color="000000"/>
-              <w:left w:val="single" w:sz="1" w:color="000000"/>
-              <w:bottom w:val="single" w:sz="1" w:color="000000"/>
-              <w:right w:val="single" w:sz="1" w:color="000000"/>
-            </w:tcBorders>
-            <w:vAlign w:val="center"/>
-          </w:tcPr>
-          <w:p>
-            <w:pPr>
-              <w:jc w:val="center"/>
-            </w:pPr>
-            <w:r>
-              <w:t>8</w:t>
-            </w:r>
-          </w:p>
-        </w:tc>
-      </w:tr>
-      <w:tr>
-        <w:tc>
-          <w:tcPr>
-            <w:tcW w:type="dxa" w:w="2160"/>
-            <w:tcBorders>
-              <w:top w:val="single" w:sz="1" w:color="000000"/>
-              <w:left w:val="single" w:sz="1" w:color="000000"/>
-              <w:bottom w:val="single" w:sz="1" w:color="000000"/>
-              <w:right w:val="single" w:sz="1" w:color="000000"/>
-            </w:tcBorders>
-          </w:tcPr>
-          <w:p>
-            <w:r/>
-          </w:p>
-        </w:tc>
-        <w:tc>
-          <w:tcPr>
-            <w:tcW w:type="dxa" w:w="2160"/>
-            <w:tcBorders>
-              <w:top w:val="single" w:sz="1" w:color="000000"/>
-              <w:left w:val="single" w:sz="1" w:color="000000"/>
-              <w:bottom w:val="single" w:sz="1" w:color="000000"/>
-              <w:right w:val="single" w:sz="1" w:color="000000"/>
-            </w:tcBorders>
-          </w:tcPr>
-          <w:p>
-            <w:r>
-              <w:t>Dependencies Identification</w:t>
-            </w:r>
-          </w:p>
-        </w:tc>
-        <w:tc>
-          <w:tcPr>
-            <w:tcW w:type="dxa" w:w="2160"/>
-            <w:tcBorders>
-              <w:top w:val="single" w:sz="1" w:color="000000"/>
-              <w:left w:val="single" w:sz="1" w:color="000000"/>
-              <w:bottom w:val="single" w:sz="1" w:color="000000"/>
-              <w:right w:val="single" w:sz="1" w:color="000000"/>
-            </w:tcBorders>
-          </w:tcPr>
-          <w:p>
-            <w:r>
-              <w:t>Develop algorithm for dependencies</w:t>
-            </w:r>
-          </w:p>
-        </w:tc>
-        <w:tc>
-          <w:tcPr>
-            <w:tcW w:type="dxa" w:w="2160"/>
-            <w:tcBorders>
-              <w:top w:val="single" w:sz="1" w:color="000000"/>
-              <w:left w:val="single" w:sz="1" w:color="000000"/>
-              <w:bottom w:val="single" w:sz="1" w:color="000000"/>
-              <w:right w:val="single" w:sz="1" w:color="000000"/>
-            </w:tcBorders>
-          </w:tcPr>
-          <w:p>
-            <w:r>
-              <w:t>Develop algorithm for identifying dependencies among tasks.</w:t>
-            </w:r>
-          </w:p>
-        </w:tc>
-        <w:tc>
-          <w:tcPr>
-            <w:tcW w:type="dxa" w:w="2160"/>
-            <w:tcBorders>
-              <w:top w:val="single" w:sz="1" w:color="000000"/>
-              <w:left w:val="single" w:sz="1" w:color="000000"/>
-              <w:bottom w:val="single" w:sz="1" w:color="000000"/>
-              <w:right w:val="single" w:sz="1" w:color="000000"/>
-            </w:tcBorders>
-            <w:vAlign w:val="center"/>
-          </w:tcPr>
-          <w:p>
-            <w:pPr>
-              <w:jc w:val="center"/>
-            </w:pPr>
-            <w:r>
-              <w:t>8</w:t>
-            </w:r>
-          </w:p>
-        </w:tc>
-      </w:tr>
-      <w:tr>
-        <w:tc>
-          <w:tcPr>
-            <w:tcW w:type="dxa" w:w="2160"/>
-            <w:tcBorders>
-              <w:top w:val="single" w:sz="1" w:color="000000"/>
-              <w:left w:val="single" w:sz="1" w:color="000000"/>
-              <w:bottom w:val="single" w:sz="1" w:color="000000"/>
-              <w:right w:val="single" w:sz="1" w:color="000000"/>
-            </w:tcBorders>
-          </w:tcPr>
-          <w:p>
-            <w:r/>
-          </w:p>
-        </w:tc>
-        <w:tc>
-          <w:tcPr>
-            <w:tcW w:type="dxa" w:w="2160"/>
-            <w:tcBorders>
-              <w:top w:val="single" w:sz="1" w:color="000000"/>
-              <w:left w:val="single" w:sz="1" w:color="000000"/>
-              <w:bottom w:val="single" w:sz="1" w:color="000000"/>
-              <w:right w:val="single" w:sz="1" w:color="000000"/>
-            </w:tcBorders>
-          </w:tcPr>
-          <w:p>
-            <w:r>
-              <w:t>Dependencies Identification</w:t>
-            </w:r>
-          </w:p>
-        </w:tc>
-        <w:tc>
-          <w:tcPr>
-            <w:tcW w:type="dxa" w:w="2160"/>
-            <w:tcBorders>
-              <w:top w:val="single" w:sz="1" w:color="000000"/>
-              <w:left w:val="single" w:sz="1" w:color="000000"/>
-              <w:bottom w:val="single" w:sz="1" w:color="000000"/>
-              <w:right w:val="single" w:sz="1" w:color="000000"/>
-            </w:tcBorders>
-          </w:tcPr>
-          <w:p>
-            <w:r>
-              <w:t>Integrate dependency visualization</w:t>
-            </w:r>
-          </w:p>
-        </w:tc>
-        <w:tc>
-          <w:tcPr>
-            <w:tcW w:type="dxa" w:w="2160"/>
-            <w:tcBorders>
-              <w:top w:val="single" w:sz="1" w:color="000000"/>
-              <w:left w:val="single" w:sz="1" w:color="000000"/>
-              <w:bottom w:val="single" w:sz="1" w:color="000000"/>
-              <w:right w:val="single" w:sz="1" w:color="000000"/>
-            </w:tcBorders>
-          </w:tcPr>
-          <w:p>
-            <w:r>
-              <w:t>Integrate dependency visualization in the project planning UI.</w:t>
+              <w:t>Include more advanced customization features for interested users.</w:t>
             </w:r>
           </w:p>
         </w:tc>
@@ -3768,7 +2088,7 @@
                 <w:b/>
                 <w:color w:val="FFFFFF"/>
               </w:rPr>
-              <w:t>Story and Task Delineation</w:t>
+              <w:t>IntuitiveUserInterface</w:t>
             </w:r>
           </w:p>
         </w:tc>
@@ -3854,7 +2174,733 @@
                 <w:b/>
                 <w:color w:val="FFFFFF"/>
               </w:rPr>
-              <w:t>48</w:t>
+              <w:t>20</w:t>
+            </w:r>
+          </w:p>
+        </w:tc>
+      </w:tr>
+      <w:tr>
+        <w:tc>
+          <w:tcPr>
+            <w:tcW w:type="dxa" w:w="2160"/>
+            <w:tcBorders>
+              <w:top w:val="single" w:sz="1" w:color="000000"/>
+              <w:left w:val="single" w:sz="1" w:color="000000"/>
+              <w:bottom w:val="single" w:sz="1" w:color="000000"/>
+              <w:right w:val="single" w:sz="1" w:color="000000"/>
+            </w:tcBorders>
+          </w:tcPr>
+          <w:p>
+            <w:r>
+              <w:t>OperationalEssentialsForMVP</w:t>
+            </w:r>
+          </w:p>
+        </w:tc>
+        <w:tc>
+          <w:tcPr>
+            <w:tcW w:type="dxa" w:w="2160"/>
+            <w:tcBorders>
+              <w:top w:val="single" w:sz="1" w:color="000000"/>
+              <w:left w:val="single" w:sz="1" w:color="000000"/>
+              <w:bottom w:val="single" w:sz="1" w:color="000000"/>
+              <w:right w:val="single" w:sz="1" w:color="000000"/>
+            </w:tcBorders>
+          </w:tcPr>
+          <w:p>
+            <w:r>
+              <w:t>UserAccountManagement</w:t>
+            </w:r>
+          </w:p>
+        </w:tc>
+        <w:tc>
+          <w:tcPr>
+            <w:tcW w:type="dxa" w:w="2160"/>
+            <w:tcBorders>
+              <w:top w:val="single" w:sz="1" w:color="000000"/>
+              <w:left w:val="single" w:sz="1" w:color="000000"/>
+              <w:bottom w:val="single" w:sz="1" w:color="000000"/>
+              <w:right w:val="single" w:sz="1" w:color="000000"/>
+            </w:tcBorders>
+          </w:tcPr>
+          <w:p>
+            <w:r>
+              <w:t>Account Management Features</w:t>
+            </w:r>
+          </w:p>
+        </w:tc>
+        <w:tc>
+          <w:tcPr>
+            <w:tcW w:type="dxa" w:w="2160"/>
+            <w:tcBorders>
+              <w:top w:val="single" w:sz="1" w:color="000000"/>
+              <w:left w:val="single" w:sz="1" w:color="000000"/>
+              <w:bottom w:val="single" w:sz="1" w:color="000000"/>
+              <w:right w:val="single" w:sz="1" w:color="000000"/>
+            </w:tcBorders>
+          </w:tcPr>
+          <w:p>
+            <w:r>
+              <w:t>Implement sign-up, login, and profile customization.</w:t>
+            </w:r>
+          </w:p>
+        </w:tc>
+        <w:tc>
+          <w:tcPr>
+            <w:tcW w:type="dxa" w:w="2160"/>
+            <w:tcBorders>
+              <w:top w:val="single" w:sz="1" w:color="000000"/>
+              <w:left w:val="single" w:sz="1" w:color="000000"/>
+              <w:bottom w:val="single" w:sz="1" w:color="000000"/>
+              <w:right w:val="single" w:sz="1" w:color="000000"/>
+            </w:tcBorders>
+            <w:vAlign w:val="center"/>
+          </w:tcPr>
+          <w:p>
+            <w:pPr>
+              <w:jc w:val="center"/>
+            </w:pPr>
+            <w:r>
+              <w:t>8</w:t>
+            </w:r>
+          </w:p>
+        </w:tc>
+      </w:tr>
+      <w:tr>
+        <w:tc>
+          <w:tcPr>
+            <w:tcW w:type="dxa" w:w="2160"/>
+            <w:tcBorders>
+              <w:top w:val="single" w:sz="1" w:color="000000"/>
+              <w:left w:val="single" w:sz="1" w:color="000000"/>
+              <w:bottom w:val="single" w:sz="1" w:color="000000"/>
+              <w:right w:val="single" w:sz="1" w:color="000000"/>
+            </w:tcBorders>
+          </w:tcPr>
+          <w:p>
+            <w:r/>
+          </w:p>
+        </w:tc>
+        <w:tc>
+          <w:tcPr>
+            <w:tcW w:type="dxa" w:w="2160"/>
+            <w:tcBorders>
+              <w:top w:val="single" w:sz="1" w:color="000000"/>
+              <w:left w:val="single" w:sz="1" w:color="000000"/>
+              <w:bottom w:val="single" w:sz="1" w:color="000000"/>
+              <w:right w:val="single" w:sz="1" w:color="000000"/>
+            </w:tcBorders>
+          </w:tcPr>
+          <w:p>
+            <w:r>
+              <w:t>ResponsiveDesign</w:t>
+            </w:r>
+          </w:p>
+        </w:tc>
+        <w:tc>
+          <w:tcPr>
+            <w:tcW w:type="dxa" w:w="2160"/>
+            <w:tcBorders>
+              <w:top w:val="single" w:sz="1" w:color="000000"/>
+              <w:left w:val="single" w:sz="1" w:color="000000"/>
+              <w:bottom w:val="single" w:sz="1" w:color="000000"/>
+              <w:right w:val="single" w:sz="1" w:color="000000"/>
+            </w:tcBorders>
+          </w:tcPr>
+          <w:p>
+            <w:r>
+              <w:t>Cross-device Responsiveness</w:t>
+            </w:r>
+          </w:p>
+        </w:tc>
+        <w:tc>
+          <w:tcPr>
+            <w:tcW w:type="dxa" w:w="2160"/>
+            <w:tcBorders>
+              <w:top w:val="single" w:sz="1" w:color="000000"/>
+              <w:left w:val="single" w:sz="1" w:color="000000"/>
+              <w:bottom w:val="single" w:sz="1" w:color="000000"/>
+              <w:right w:val="single" w:sz="1" w:color="000000"/>
+            </w:tcBorders>
+          </w:tcPr>
+          <w:p>
+            <w:r>
+              <w:t>Ensure responsiveness across devices and screen sizes.</w:t>
+            </w:r>
+          </w:p>
+        </w:tc>
+        <w:tc>
+          <w:tcPr>
+            <w:tcW w:type="dxa" w:w="2160"/>
+            <w:tcBorders>
+              <w:top w:val="single" w:sz="1" w:color="000000"/>
+              <w:left w:val="single" w:sz="1" w:color="000000"/>
+              <w:bottom w:val="single" w:sz="1" w:color="000000"/>
+              <w:right w:val="single" w:sz="1" w:color="000000"/>
+            </w:tcBorders>
+            <w:vAlign w:val="center"/>
+          </w:tcPr>
+          <w:p>
+            <w:pPr>
+              <w:jc w:val="center"/>
+            </w:pPr>
+            <w:r>
+              <w:t>8</w:t>
+            </w:r>
+          </w:p>
+        </w:tc>
+      </w:tr>
+      <w:tr>
+        <w:tc>
+          <w:tcPr>
+            <w:tcW w:type="dxa" w:w="2160"/>
+            <w:tcBorders>
+              <w:top w:val="single" w:sz="1" w:color="000000"/>
+              <w:left w:val="single" w:sz="1" w:color="000000"/>
+              <w:bottom w:val="single" w:sz="1" w:color="000000"/>
+              <w:right w:val="single" w:sz="1" w:color="000000"/>
+            </w:tcBorders>
+          </w:tcPr>
+          <w:p>
+            <w:r/>
+          </w:p>
+        </w:tc>
+        <w:tc>
+          <w:tcPr>
+            <w:tcW w:type="dxa" w:w="2160"/>
+            <w:tcBorders>
+              <w:top w:val="single" w:sz="1" w:color="000000"/>
+              <w:left w:val="single" w:sz="1" w:color="000000"/>
+              <w:bottom w:val="single" w:sz="1" w:color="000000"/>
+              <w:right w:val="single" w:sz="1" w:color="000000"/>
+            </w:tcBorders>
+          </w:tcPr>
+          <w:p>
+            <w:r>
+              <w:t>SecurityMeasures</w:t>
+            </w:r>
+          </w:p>
+        </w:tc>
+        <w:tc>
+          <w:tcPr>
+            <w:tcW w:type="dxa" w:w="2160"/>
+            <w:tcBorders>
+              <w:top w:val="single" w:sz="1" w:color="000000"/>
+              <w:left w:val="single" w:sz="1" w:color="000000"/>
+              <w:bottom w:val="single" w:sz="1" w:color="000000"/>
+              <w:right w:val="single" w:sz="1" w:color="000000"/>
+            </w:tcBorders>
+          </w:tcPr>
+          <w:p>
+            <w:r>
+              <w:t>Data Protection Practices</w:t>
+            </w:r>
+          </w:p>
+        </w:tc>
+        <w:tc>
+          <w:tcPr>
+            <w:tcW w:type="dxa" w:w="2160"/>
+            <w:tcBorders>
+              <w:top w:val="single" w:sz="1" w:color="000000"/>
+              <w:left w:val="single" w:sz="1" w:color="000000"/>
+              <w:bottom w:val="single" w:sz="1" w:color="000000"/>
+              <w:right w:val="single" w:sz="1" w:color="000000"/>
+            </w:tcBorders>
+          </w:tcPr>
+          <w:p>
+            <w:r>
+              <w:t>Adopt standard security practices for data protection.</w:t>
+            </w:r>
+          </w:p>
+        </w:tc>
+        <w:tc>
+          <w:tcPr>
+            <w:tcW w:type="dxa" w:w="2160"/>
+            <w:tcBorders>
+              <w:top w:val="single" w:sz="1" w:color="000000"/>
+              <w:left w:val="single" w:sz="1" w:color="000000"/>
+              <w:bottom w:val="single" w:sz="1" w:color="000000"/>
+              <w:right w:val="single" w:sz="1" w:color="000000"/>
+            </w:tcBorders>
+            <w:vAlign w:val="center"/>
+          </w:tcPr>
+          <w:p>
+            <w:pPr>
+              <w:jc w:val="center"/>
+            </w:pPr>
+            <w:r>
+              <w:t>8</w:t>
+            </w:r>
+          </w:p>
+        </w:tc>
+      </w:tr>
+      <w:tr>
+        <w:tc>
+          <w:tcPr>
+            <w:tcW w:type="dxa" w:w="2160"/>
+            <w:tcBorders>
+              <w:top w:val="single" w:sz="1" w:color="000000"/>
+              <w:left w:val="single" w:sz="1" w:color="000000"/>
+              <w:bottom w:val="single" w:sz="1" w:color="000000"/>
+              <w:right w:val="single" w:sz="1" w:color="000000"/>
+            </w:tcBorders>
+          </w:tcPr>
+          <w:p>
+            <w:r/>
+          </w:p>
+        </w:tc>
+        <w:tc>
+          <w:tcPr>
+            <w:tcW w:type="dxa" w:w="2160"/>
+            <w:tcBorders>
+              <w:top w:val="single" w:sz="1" w:color="000000"/>
+              <w:left w:val="single" w:sz="1" w:color="000000"/>
+              <w:bottom w:val="single" w:sz="1" w:color="000000"/>
+              <w:right w:val="single" w:sz="1" w:color="000000"/>
+            </w:tcBorders>
+          </w:tcPr>
+          <w:p>
+            <w:r>
+              <w:t>FeedbackMechanism</w:t>
+            </w:r>
+          </w:p>
+        </w:tc>
+        <w:tc>
+          <w:tcPr>
+            <w:tcW w:type="dxa" w:w="2160"/>
+            <w:tcBorders>
+              <w:top w:val="single" w:sz="1" w:color="000000"/>
+              <w:left w:val="single" w:sz="1" w:color="000000"/>
+              <w:bottom w:val="single" w:sz="1" w:color="000000"/>
+              <w:right w:val="single" w:sz="1" w:color="000000"/>
+            </w:tcBorders>
+          </w:tcPr>
+          <w:p>
+            <w:r>
+              <w:t>User Feedback Incorporation</w:t>
+            </w:r>
+          </w:p>
+        </w:tc>
+        <w:tc>
+          <w:tcPr>
+            <w:tcW w:type="dxa" w:w="2160"/>
+            <w:tcBorders>
+              <w:top w:val="single" w:sz="1" w:color="000000"/>
+              <w:left w:val="single" w:sz="1" w:color="000000"/>
+              <w:bottom w:val="single" w:sz="1" w:color="000000"/>
+              <w:right w:val="single" w:sz="1" w:color="000000"/>
+            </w:tcBorders>
+          </w:tcPr>
+          <w:p>
+            <w:r>
+              <w:t>Incorporate a mechanism for user feedback.</w:t>
+            </w:r>
+          </w:p>
+        </w:tc>
+        <w:tc>
+          <w:tcPr>
+            <w:tcW w:type="dxa" w:w="2160"/>
+            <w:tcBorders>
+              <w:top w:val="single" w:sz="1" w:color="000000"/>
+              <w:left w:val="single" w:sz="1" w:color="000000"/>
+              <w:bottom w:val="single" w:sz="1" w:color="000000"/>
+              <w:right w:val="single" w:sz="1" w:color="000000"/>
+            </w:tcBorders>
+            <w:vAlign w:val="center"/>
+          </w:tcPr>
+          <w:p>
+            <w:pPr>
+              <w:jc w:val="center"/>
+            </w:pPr>
+            <w:r>
+              <w:t>6</w:t>
+            </w:r>
+          </w:p>
+        </w:tc>
+      </w:tr>
+      <w:tr>
+        <w:tc>
+          <w:tcPr>
+            <w:tcW w:type="dxa" w:w="2160"/>
+            <w:tcBorders>
+              <w:top w:val="single" w:sz="1" w:color="000000"/>
+              <w:left w:val="single" w:sz="1" w:color="000000"/>
+              <w:bottom w:val="single" w:sz="1" w:color="000000"/>
+              <w:right w:val="single" w:sz="1" w:color="000000"/>
+            </w:tcBorders>
+            <w:shd w:fill="000000"/>
+          </w:tcPr>
+          <w:p>
+            <w:r>
+              <w:rPr>
+                <w:b/>
+                <w:color w:val="FFFFFF"/>
+              </w:rPr>
+              <w:t>OperationalEssentialsForMVP</w:t>
+            </w:r>
+          </w:p>
+        </w:tc>
+        <w:tc>
+          <w:tcPr>
+            <w:tcW w:type="dxa" w:w="2160"/>
+            <w:tcBorders>
+              <w:top w:val="single" w:sz="1" w:color="000000"/>
+              <w:left w:val="single" w:sz="1" w:color="000000"/>
+              <w:bottom w:val="single" w:sz="1" w:color="000000"/>
+              <w:right w:val="single" w:sz="1" w:color="000000"/>
+            </w:tcBorders>
+            <w:shd w:fill="000000"/>
+          </w:tcPr>
+          <w:p>
+            <w:r>
+              <w:rPr>
+                <w:b/>
+                <w:color w:val="FFFFFF"/>
+              </w:rPr>
+            </w:r>
+          </w:p>
+        </w:tc>
+        <w:tc>
+          <w:tcPr>
+            <w:tcW w:type="dxa" w:w="2160"/>
+            <w:tcBorders>
+              <w:top w:val="single" w:sz="1" w:color="000000"/>
+              <w:left w:val="single" w:sz="1" w:color="000000"/>
+              <w:bottom w:val="single" w:sz="1" w:color="000000"/>
+              <w:right w:val="single" w:sz="1" w:color="000000"/>
+            </w:tcBorders>
+            <w:shd w:fill="000000"/>
+          </w:tcPr>
+          <w:p>
+            <w:r>
+              <w:rPr>
+                <w:b/>
+                <w:color w:val="FFFFFF"/>
+              </w:rPr>
+            </w:r>
+          </w:p>
+        </w:tc>
+        <w:tc>
+          <w:tcPr>
+            <w:tcW w:type="dxa" w:w="2160"/>
+            <w:tcBorders>
+              <w:top w:val="single" w:sz="1" w:color="000000"/>
+              <w:left w:val="single" w:sz="1" w:color="000000"/>
+              <w:bottom w:val="single" w:sz="1" w:color="000000"/>
+              <w:right w:val="single" w:sz="1" w:color="000000"/>
+            </w:tcBorders>
+            <w:shd w:fill="000000"/>
+          </w:tcPr>
+          <w:p>
+            <w:r>
+              <w:rPr>
+                <w:b/>
+                <w:color w:val="FFFFFF"/>
+              </w:rPr>
+              <w:t>Total Hours</w:t>
+            </w:r>
+          </w:p>
+        </w:tc>
+        <w:tc>
+          <w:tcPr>
+            <w:tcW w:type="dxa" w:w="2160"/>
+            <w:tcBorders>
+              <w:top w:val="single" w:sz="1" w:color="000000"/>
+              <w:left w:val="single" w:sz="1" w:color="000000"/>
+              <w:bottom w:val="single" w:sz="1" w:color="000000"/>
+              <w:right w:val="single" w:sz="1" w:color="000000"/>
+            </w:tcBorders>
+            <w:vAlign w:val="center"/>
+            <w:shd w:fill="000000"/>
+          </w:tcPr>
+          <w:p>
+            <w:pPr>
+              <w:jc w:val="center"/>
+            </w:pPr>
+            <w:r>
+              <w:rPr>
+                <w:b/>
+                <w:color w:val="FFFFFF"/>
+              </w:rPr>
+              <w:t>30</w:t>
+            </w:r>
+          </w:p>
+        </w:tc>
+      </w:tr>
+      <w:tr>
+        <w:tc>
+          <w:tcPr>
+            <w:tcW w:type="dxa" w:w="2160"/>
+            <w:tcBorders>
+              <w:top w:val="single" w:sz="1" w:color="000000"/>
+              <w:left w:val="single" w:sz="1" w:color="000000"/>
+              <w:bottom w:val="single" w:sz="1" w:color="000000"/>
+              <w:right w:val="single" w:sz="1" w:color="000000"/>
+            </w:tcBorders>
+          </w:tcPr>
+          <w:p>
+            <w:r>
+              <w:t>ScalableTechnologyStack</w:t>
+            </w:r>
+          </w:p>
+        </w:tc>
+        <w:tc>
+          <w:tcPr>
+            <w:tcW w:type="dxa" w:w="2160"/>
+            <w:tcBorders>
+              <w:top w:val="single" w:sz="1" w:color="000000"/>
+              <w:left w:val="single" w:sz="1" w:color="000000"/>
+              <w:bottom w:val="single" w:sz="1" w:color="000000"/>
+              <w:right w:val="single" w:sz="1" w:color="000000"/>
+            </w:tcBorders>
+          </w:tcPr>
+          <w:p>
+            <w:r>
+              <w:t>ModularArchitecture</w:t>
+            </w:r>
+          </w:p>
+        </w:tc>
+        <w:tc>
+          <w:tcPr>
+            <w:tcW w:type="dxa" w:w="2160"/>
+            <w:tcBorders>
+              <w:top w:val="single" w:sz="1" w:color="000000"/>
+              <w:left w:val="single" w:sz="1" w:color="000000"/>
+              <w:bottom w:val="single" w:sz="1" w:color="000000"/>
+              <w:right w:val="single" w:sz="1" w:color="000000"/>
+            </w:tcBorders>
+          </w:tcPr>
+          <w:p>
+            <w:r>
+              <w:t>Technology Stack Selection</w:t>
+            </w:r>
+          </w:p>
+        </w:tc>
+        <w:tc>
+          <w:tcPr>
+            <w:tcW w:type="dxa" w:w="2160"/>
+            <w:tcBorders>
+              <w:top w:val="single" w:sz="1" w:color="000000"/>
+              <w:left w:val="single" w:sz="1" w:color="000000"/>
+              <w:bottom w:val="single" w:sz="1" w:color="000000"/>
+              <w:right w:val="single" w:sz="1" w:color="000000"/>
+            </w:tcBorders>
+          </w:tcPr>
+          <w:p>
+            <w:r>
+              <w:t>Choose a technology stack that supports modular development.</w:t>
+            </w:r>
+          </w:p>
+        </w:tc>
+        <w:tc>
+          <w:tcPr>
+            <w:tcW w:type="dxa" w:w="2160"/>
+            <w:tcBorders>
+              <w:top w:val="single" w:sz="1" w:color="000000"/>
+              <w:left w:val="single" w:sz="1" w:color="000000"/>
+              <w:bottom w:val="single" w:sz="1" w:color="000000"/>
+              <w:right w:val="single" w:sz="1" w:color="000000"/>
+            </w:tcBorders>
+            <w:vAlign w:val="center"/>
+          </w:tcPr>
+          <w:p>
+            <w:pPr>
+              <w:jc w:val="center"/>
+            </w:pPr>
+            <w:r>
+              <w:t>8</w:t>
+            </w:r>
+          </w:p>
+        </w:tc>
+      </w:tr>
+      <w:tr>
+        <w:tc>
+          <w:tcPr>
+            <w:tcW w:type="dxa" w:w="2160"/>
+            <w:tcBorders>
+              <w:top w:val="single" w:sz="1" w:color="000000"/>
+              <w:left w:val="single" w:sz="1" w:color="000000"/>
+              <w:bottom w:val="single" w:sz="1" w:color="000000"/>
+              <w:right w:val="single" w:sz="1" w:color="000000"/>
+            </w:tcBorders>
+          </w:tcPr>
+          <w:p>
+            <w:r/>
+          </w:p>
+        </w:tc>
+        <w:tc>
+          <w:tcPr>
+            <w:tcW w:type="dxa" w:w="2160"/>
+            <w:tcBorders>
+              <w:top w:val="single" w:sz="1" w:color="000000"/>
+              <w:left w:val="single" w:sz="1" w:color="000000"/>
+              <w:bottom w:val="single" w:sz="1" w:color="000000"/>
+              <w:right w:val="single" w:sz="1" w:color="000000"/>
+            </w:tcBorders>
+          </w:tcPr>
+          <w:p>
+            <w:r>
+              <w:t>IntegrationCapabilities</w:t>
+            </w:r>
+          </w:p>
+        </w:tc>
+        <w:tc>
+          <w:tcPr>
+            <w:tcW w:type="dxa" w:w="2160"/>
+            <w:tcBorders>
+              <w:top w:val="single" w:sz="1" w:color="000000"/>
+              <w:left w:val="single" w:sz="1" w:color="000000"/>
+              <w:bottom w:val="single" w:sz="1" w:color="000000"/>
+              <w:right w:val="single" w:sz="1" w:color="000000"/>
+            </w:tcBorders>
+          </w:tcPr>
+          <w:p>
+            <w:r>
+              <w:t>Integration With SME Tools</w:t>
+            </w:r>
+          </w:p>
+        </w:tc>
+        <w:tc>
+          <w:tcPr>
+            <w:tcW w:type="dxa" w:w="2160"/>
+            <w:tcBorders>
+              <w:top w:val="single" w:sz="1" w:color="000000"/>
+              <w:left w:val="single" w:sz="1" w:color="000000"/>
+              <w:bottom w:val="single" w:sz="1" w:color="000000"/>
+              <w:right w:val="single" w:sz="1" w:color="000000"/>
+            </w:tcBorders>
+          </w:tcPr>
+          <w:p>
+            <w:r>
+              <w:t>Ensure integration with popular SME tools and platforms.</w:t>
+            </w:r>
+          </w:p>
+        </w:tc>
+        <w:tc>
+          <w:tcPr>
+            <w:tcW w:type="dxa" w:w="2160"/>
+            <w:tcBorders>
+              <w:top w:val="single" w:sz="1" w:color="000000"/>
+              <w:left w:val="single" w:sz="1" w:color="000000"/>
+              <w:bottom w:val="single" w:sz="1" w:color="000000"/>
+              <w:right w:val="single" w:sz="1" w:color="000000"/>
+            </w:tcBorders>
+            <w:vAlign w:val="center"/>
+          </w:tcPr>
+          <w:p>
+            <w:pPr>
+              <w:jc w:val="center"/>
+            </w:pPr>
+            <w:r>
+              <w:t>8</w:t>
+            </w:r>
+          </w:p>
+        </w:tc>
+      </w:tr>
+      <w:tr>
+        <w:tc>
+          <w:tcPr>
+            <w:tcW w:type="dxa" w:w="2160"/>
+            <w:tcBorders>
+              <w:top w:val="single" w:sz="1" w:color="000000"/>
+              <w:left w:val="single" w:sz="1" w:color="000000"/>
+              <w:bottom w:val="single" w:sz="1" w:color="000000"/>
+              <w:right w:val="single" w:sz="1" w:color="000000"/>
+            </w:tcBorders>
+            <w:shd w:fill="000000"/>
+          </w:tcPr>
+          <w:p>
+            <w:r>
+              <w:rPr>
+                <w:b/>
+                <w:color w:val="FFFFFF"/>
+              </w:rPr>
+              <w:t>ScalableTechnologyStack</w:t>
+            </w:r>
+          </w:p>
+        </w:tc>
+        <w:tc>
+          <w:tcPr>
+            <w:tcW w:type="dxa" w:w="2160"/>
+            <w:tcBorders>
+              <w:top w:val="single" w:sz="1" w:color="000000"/>
+              <w:left w:val="single" w:sz="1" w:color="000000"/>
+              <w:bottom w:val="single" w:sz="1" w:color="000000"/>
+              <w:right w:val="single" w:sz="1" w:color="000000"/>
+            </w:tcBorders>
+            <w:shd w:fill="000000"/>
+          </w:tcPr>
+          <w:p>
+            <w:r>
+              <w:rPr>
+                <w:b/>
+                <w:color w:val="FFFFFF"/>
+              </w:rPr>
+            </w:r>
+          </w:p>
+        </w:tc>
+        <w:tc>
+          <w:tcPr>
+            <w:tcW w:type="dxa" w:w="2160"/>
+            <w:tcBorders>
+              <w:top w:val="single" w:sz="1" w:color="000000"/>
+              <w:left w:val="single" w:sz="1" w:color="000000"/>
+              <w:bottom w:val="single" w:sz="1" w:color="000000"/>
+              <w:right w:val="single" w:sz="1" w:color="000000"/>
+            </w:tcBorders>
+            <w:shd w:fill="000000"/>
+          </w:tcPr>
+          <w:p>
+            <w:r>
+              <w:rPr>
+                <w:b/>
+                <w:color w:val="FFFFFF"/>
+              </w:rPr>
+            </w:r>
+          </w:p>
+        </w:tc>
+        <w:tc>
+          <w:tcPr>
+            <w:tcW w:type="dxa" w:w="2160"/>
+            <w:tcBorders>
+              <w:top w:val="single" w:sz="1" w:color="000000"/>
+              <w:left w:val="single" w:sz="1" w:color="000000"/>
+              <w:bottom w:val="single" w:sz="1" w:color="000000"/>
+              <w:right w:val="single" w:sz="1" w:color="000000"/>
+            </w:tcBorders>
+            <w:shd w:fill="000000"/>
+          </w:tcPr>
+          <w:p>
+            <w:r>
+              <w:rPr>
+                <w:b/>
+                <w:color w:val="FFFFFF"/>
+              </w:rPr>
+              <w:t>Total Hours</w:t>
+            </w:r>
+          </w:p>
+        </w:tc>
+        <w:tc>
+          <w:tcPr>
+            <w:tcW w:type="dxa" w:w="2160"/>
+            <w:tcBorders>
+              <w:top w:val="single" w:sz="1" w:color="000000"/>
+              <w:left w:val="single" w:sz="1" w:color="000000"/>
+              <w:bottom w:val="single" w:sz="1" w:color="000000"/>
+              <w:right w:val="single" w:sz="1" w:color="000000"/>
+            </w:tcBorders>
+            <w:vAlign w:val="center"/>
+            <w:shd w:fill="000000"/>
+          </w:tcPr>
+          <w:p>
+            <w:pPr>
+              <w:jc w:val="center"/>
+            </w:pPr>
+            <w:r>
+              <w:rPr>
+                <w:b/>
+                <w:color w:val="FFFFFF"/>
+              </w:rPr>
+              <w:t>16</w:t>
             </w:r>
           </w:p>
         </w:tc>

</xml_diff>